<commit_message>
Complete FSD Case Study Report DOCX adhering strictly to MLRITM template
</commit_message>
<xml_diff>
--- a/docs/LinkFlow_FSD_Case_Study_Report.docx
+++ b/docs/LinkFlow_FSD_Case_Study_Report.docx
@@ -4,6 +4,7 @@
   <w:body>
     <w:p>
       <w:pPr>
+        <w:spacing w:after="120"/>
         <w:jc w:val="center"/>
       </w:pPr>
       <w:r>
@@ -11,25 +12,26 @@
           <w:rFonts w:ascii="Arial" w:hAnsi="Arial"/>
           <w:b/>
           <w:color w:val="475569"/>
-          <w:sz w:val="28"/>
+          <w:sz w:val="24"/>
         </w:rPr>
-        <w:t>FULL STACK DEVELOPMENT (Course Code: 2550544)</w:t>
+        <w:t>Course: FULL STACK DEVELOPMENT (Course Code: 2550544)</w:t>
       </w:r>
     </w:p>
     <w:p>
       <w:pPr>
-        <w:spacing w:after="240"/>
+        <w:spacing w:after="200"/>
       </w:pPr>
     </w:p>
     <w:p>
       <w:pPr>
+        <w:spacing w:before="480" w:after="240"/>
         <w:jc w:val="center"/>
       </w:pPr>
       <w:r>
         <w:rPr>
           <w:rFonts w:ascii="Arial" w:hAnsi="Arial"/>
           <w:b/>
-          <w:color w:val="6366F1"/>
+          <w:color w:val="2563EB"/>
           <w:sz w:val="44"/>
         </w:rPr>
         <w:t>FSD CASE STUDY REPORT</w:t>
@@ -37,6 +39,7 @@
     </w:p>
     <w:p>
       <w:pPr>
+        <w:spacing w:after="120"/>
         <w:jc w:val="center"/>
       </w:pPr>
       <w:r>
@@ -44,19 +47,21 @@
           <w:rFonts w:ascii="Arial" w:hAnsi="Arial"/>
           <w:b/>
           <w:color w:val="475569"/>
-          <w:sz w:val="28"/>
+          <w:sz w:val="24"/>
         </w:rPr>
         <w:t>LinkFlow - Enterprise URL Shortener &amp; Link Analytics Platform</w:t>
       </w:r>
     </w:p>
     <w:p>
       <w:pPr>
-        <w:spacing w:before="400" w:after="600"/>
+        <w:spacing w:before="600" w:after="800"/>
         <w:jc w:val="center"/>
       </w:pPr>
       <w:r>
         <w:rPr>
+          <w:rFonts w:ascii="Arial" w:hAnsi="Arial"/>
           <w:b/>
+          <w:color w:val="2563EB"/>
           <w:sz w:val="24"/>
         </w:rPr>
         <w:t>Presented By:</w:t>
@@ -64,11 +69,14 @@
       </w:r>
       <w:r>
         <w:rPr>
+          <w:rFonts w:ascii="Arial" w:hAnsi="Arial"/>
+          <w:color w:val="1E293B"/>
           <w:sz w:val="22"/>
         </w:rPr>
         <w:t>MITTA ARYAN RUPESH</w:t>
         <w:br/>
         <w:t>Department of CSE, MLRITM</w:t>
+        <w:br/>
         <w:br/>
         <w:br/>
         <w:t>Submitted To:</w:t>
@@ -86,14 +94,15 @@
     </w:p>
     <w:p>
       <w:pPr>
-        <w:spacing w:before="360" w:after="120"/>
+        <w:keepNext/>
+        <w:spacing w:before="360" w:after="160"/>
       </w:pPr>
       <w:r>
         <w:rPr>
           <w:rFonts w:ascii="Arial" w:hAnsi="Arial"/>
           <w:b/>
-          <w:color w:val="6366F1"/>
-          <w:sz w:val="32"/>
+          <w:color w:val="2563EB"/>
+          <w:sz w:val="30"/>
         </w:rPr>
         <w:t>Summary of the Case Study</w:t>
       </w:r>
@@ -105,10 +114,10 @@
       <w:r>
         <w:rPr>
           <w:rFonts w:ascii="Calibri" w:hAnsi="Calibri"/>
-          <w:color w:val="0F172A"/>
+          <w:color w:val="1E293B"/>
           <w:sz w:val="22"/>
         </w:rPr>
-        <w:t>LinkFlow is a commercial-grade, full-stack enterprise URL shortening and link analytics platform designed to solve the scalability, security, and tracking limitations of traditional link management tools. Built using standard Node.js, Express, HTML5, Vanilla CSS3 (Dark Glassmorphism), JavaScript ES6+, and Chart.js, LinkFlow provides custom branded slugs, instant high-resolution QR code generation, password-protected links, automatic expiration/click limits, UTM parameter builders, and real-time click tracking.</w:t>
+        <w:t>LinkFlow is a commercial-grade, full-stack enterprise URL shortening, password protection, and real-time link analytics platform. Engineered using Node.js, Express.js, HTML5, Vanilla CSS3 (Dark Glassmorphism UI), JavaScript (ES6+), and Chart.js, LinkFlow solves the critical challenges of link clutter, security vulnerabilities, single-point database dependencies, and expensive third-party paywalls. The platform enables users to convert complex, long marketing URLs into concise custom vanity aliases (e.g., linkflow.io/summer-sale) while offering instant high-resolution QR code downloads, UTM parameter building, passcode-restricted link redirection, and automated expiration/click-limit controls.</w:t>
       </w:r>
     </w:p>
     <w:p>
@@ -118,29 +127,31 @@
       <w:r>
         <w:rPr>
           <w:rFonts w:ascii="Calibri" w:hAnsi="Calibri"/>
-          <w:color w:val="0F172A"/>
+          <w:color w:val="1E293B"/>
           <w:sz w:val="22"/>
         </w:rPr>
-        <w:t>A key architectural innovation in LinkFlow is its Zero-Setup Dual-Engine Storage System (src/db/storage.js). The application auto-detects MongoDB or MongoDB Atlas cluster availability. If database connectivity is absent, it seamlessly falls back to an embedded JSON storage engine without throwing runtime errors or disrupting service. LinkFlow also features a live Link Health Diagnostics Scanner, a Social Sharing Hub, and a complete v1 REST API with 9 endpoints for full developer integration. Comprehensive automated integration testing using Jest and Supertest validates all backend operations with 100% test suite pass rate.</w:t>
+        <w:t>A central innovation of LinkFlow is its Zero-Setup Dual-Engine Storage Architecture (src/db/storage.js). The platform auto-detects MongoDB or MongoDB Atlas cluster availability. If cloud or local database connectivity is unconfigured or offline, LinkFlow seamlessly falls back to an embedded JSON file storage engine without throwing runtime exception errors or interrupting operations. LinkFlow also features an automated Link Health Audit Scanner, a multi-platform Social Sharing Hub, and a complete v1 REST API with 9 documented endpoints. The application has been fully verified via automated Jest and Supertest integration test suites with a 100% pass rate.</w:t>
       </w:r>
     </w:p>
     <w:p>
       <w:pPr>
-        <w:spacing w:before="360" w:after="120"/>
+        <w:keepNext/>
+        <w:spacing w:before="360" w:after="160"/>
       </w:pPr>
       <w:r>
         <w:rPr>
           <w:rFonts w:ascii="Arial" w:hAnsi="Arial"/>
           <w:b/>
-          <w:color w:val="6366F1"/>
-          <w:sz w:val="32"/>
+          <w:color w:val="2563EB"/>
+          <w:sz w:val="30"/>
         </w:rPr>
-        <w:t>1. Introduction</w:t>
+        <w:t>Introduction</w:t>
       </w:r>
     </w:p>
     <w:p>
       <w:pPr>
-        <w:spacing w:before="280" w:after="80"/>
+        <w:keepNext/>
+        <w:spacing w:before="280" w:after="120"/>
       </w:pPr>
       <w:r>
         <w:rPr>
@@ -149,7 +160,7 @@
           <w:color w:val="0F172A"/>
           <w:sz w:val="26"/>
         </w:rPr>
-        <w:t>1.1 Background</w:t>
+        <w:t>Background</w:t>
       </w:r>
     </w:p>
     <w:p>
@@ -159,15 +170,16 @@
       <w:r>
         <w:rPr>
           <w:rFonts w:ascii="Calibri" w:hAnsi="Calibri"/>
-          <w:color w:val="0F172A"/>
+          <w:color w:val="1E293B"/>
           <w:sz w:val="22"/>
         </w:rPr>
-        <w:t>In modern digital marketing, enterprise communication, and web operations, long URLs containing heavy query parameters, tracking tokens, and deep links are difficult to share, visually unappealing, and impossible to track cleanly. URL shorteners transform cumbersome links into concise, branded URLs that improve click-through rates (CTR) and enable granular campaign tracking.</w:t>
+        <w:t>In contemporary digital ecosystems, marketing campaigns, corporate communications, and software deployments rely on sharing links across multiple channels (email, social media, messaging apps, print QR codes). However, raw destination URLs often contain extensive query strings, UTM parameters, session tokens, and deep-link routing identifiers that make links visually unappealing, prone to formatting breaks, and difficult to remember.</w:t>
       </w:r>
     </w:p>
     <w:p>
       <w:pPr>
-        <w:spacing w:before="280" w:after="80"/>
+        <w:keepNext/>
+        <w:spacing w:before="280" w:after="120"/>
       </w:pPr>
       <w:r>
         <w:rPr>
@@ -176,7 +188,7 @@
           <w:color w:val="0F172A"/>
           <w:sz w:val="26"/>
         </w:rPr>
-        <w:t>1.2 Problem Statement</w:t>
+        <w:t>Problem Statement</w:t>
       </w:r>
     </w:p>
     <w:p>
@@ -186,15 +198,24 @@
       <w:r>
         <w:rPr>
           <w:rFonts w:ascii="Calibri" w:hAnsi="Calibri"/>
-          <w:color w:val="0F172A"/>
+          <w:color w:val="1E293B"/>
           <w:sz w:val="22"/>
         </w:rPr>
-        <w:t>Existing public URL shorteners suffer from significant drawbacks: strict rate limits, expensive subscription tiers for basic analytics, lack of privacy controls (e.g., password protection), single-point database dependencies that crash applications during setup, and opaque data retention policies. Organizations require a self-hostable, market-ready full-stack platform that delivers custom aliases, passcode security, dual-storage resilience, and complete analytics control.</w:t>
+        <w:t>Traditional public URL shorteners suffer from several operational limitations:</w:t>
+        <w:br/>
+        <w:t>1. High Commercial Costs: Basic features like custom branded slugs and detailed analytics are locked behind expensive paywalls.</w:t>
+        <w:br/>
+        <w:t>2. Lack of Privacy &amp; Security: Sensitive organizational links cannot be password-protected or restricted to designated access windows.</w:t>
+        <w:br/>
+        <w:t>3. Database Setup Deadlocks: Standard full-stack applications fail completely if a local database instance (such as MongoDB) is missing during setup.</w:t>
+        <w:br/>
+        <w:t>4. Fragmented Telemetry: Marketers lack real-time insights into device categories, traffic referrers, and link health diagnostics.</w:t>
       </w:r>
     </w:p>
     <w:p>
       <w:pPr>
-        <w:spacing w:before="280" w:after="80"/>
+        <w:keepNext/>
+        <w:spacing w:before="280" w:after="120"/>
       </w:pPr>
       <w:r>
         <w:rPr>
@@ -203,7 +224,7 @@
           <w:color w:val="0F172A"/>
           <w:sz w:val="26"/>
         </w:rPr>
-        <w:t>1.3 Motivation</w:t>
+        <w:t>Motivation</w:t>
       </w:r>
     </w:p>
     <w:p>
@@ -213,15 +234,16 @@
       <w:r>
         <w:rPr>
           <w:rFonts w:ascii="Calibri" w:hAnsi="Calibri"/>
-          <w:color w:val="0F172A"/>
+          <w:color w:val="1E293B"/>
           <w:sz w:val="22"/>
         </w:rPr>
-        <w:t>The motivation behind LinkFlow is to engineer an enterprise-class, full-stack application that combines robust software design patterns (MVC separation, service layer abstraction, middleware rate limiting) with state-of-the-art UI/UX design (glassmorphic dark theme, micro-animations, interactive charts). Furthermore, LinkFlow aims to deliver zero-configuration setup, allowing developers to clone and run the system instantly on any machine regardless of local database installation.</w:t>
+        <w:t>The primary motivation for developing LinkFlow is to engineer a self-hostable, market-ready full-stack software system that adheres to modern software engineering principles (MVC architecture, service layer abstraction, middleware rate limiting) while eliminating setup friction through a zero-configuration dual-storage engine. LinkFlow demonstrates that an enterprise-ready link platform can combine extreme reliability, rich dark-glassmorphism UI design, and high-performance redirection latency under 20 milliseconds.</w:t>
       </w:r>
     </w:p>
     <w:p>
       <w:pPr>
-        <w:spacing w:before="280" w:after="80"/>
+        <w:keepNext/>
+        <w:spacing w:before="280" w:after="120"/>
       </w:pPr>
       <w:r>
         <w:rPr>
@@ -230,7 +252,7 @@
           <w:color w:val="0F172A"/>
           <w:sz w:val="26"/>
         </w:rPr>
-        <w:t>1.4 Objectives</w:t>
+        <w:t>Objectives</w:t>
       </w:r>
     </w:p>
     <w:p>
@@ -242,18 +264,18 @@
         <w:rPr>
           <w:rFonts w:ascii="Calibri" w:hAnsi="Calibri"/>
           <w:b/>
-          <w:color w:val="0F172A"/>
+          <w:color w:val="1E293B"/>
           <w:sz w:val="22"/>
         </w:rPr>
-        <w:t xml:space="preserve">1. RESTful Backend Engine: </w:t>
+        <w:t xml:space="preserve">1. RESTful API Engine: </w:t>
       </w:r>
       <w:r>
         <w:rPr>
           <w:rFonts w:ascii="Calibri" w:hAnsi="Calibri"/>
-          <w:color w:val="0F172A"/>
+          <w:color w:val="1E293B"/>
           <w:sz w:val="22"/>
         </w:rPr>
-        <w:t>Develop a scalable RESTful API engine in Node.js/Express for link shortening, redirection, and link management.</w:t>
+        <w:t>Architect a RESTful API backend using Node.js and Express.js for single/bulk URL shortening, redirection, and telemetry.</w:t>
       </w:r>
     </w:p>
     <w:p>
@@ -265,18 +287,18 @@
         <w:rPr>
           <w:rFonts w:ascii="Calibri" w:hAnsi="Calibri"/>
           <w:b/>
-          <w:color w:val="0F172A"/>
+          <w:color w:val="1E293B"/>
           <w:sz w:val="22"/>
         </w:rPr>
-        <w:t xml:space="preserve">2. Resilience &amp; Storage: </w:t>
+        <w:t xml:space="preserve">2. Storage Resilience: </w:t>
       </w:r>
       <w:r>
         <w:rPr>
           <w:rFonts w:ascii="Calibri" w:hAnsi="Calibri"/>
-          <w:color w:val="0F172A"/>
+          <w:color w:val="1E293B"/>
           <w:sz w:val="22"/>
         </w:rPr>
-        <w:t>Architect a Dual-Engine Storage abstraction (MongoDB + Embedded JSON fallback) for 100% operational uptime.</w:t>
+        <w:t>Develop a Zero-Setup Dual-Engine Storage system (MongoDB + Embedded Local JSON fallback) for 100% operational uptime.</w:t>
       </w:r>
     </w:p>
     <w:p>
@@ -288,7 +310,7 @@
         <w:rPr>
           <w:rFonts w:ascii="Calibri" w:hAnsi="Calibri"/>
           <w:b/>
-          <w:color w:val="0F172A"/>
+          <w:color w:val="1E293B"/>
           <w:sz w:val="22"/>
         </w:rPr>
         <w:t xml:space="preserve">3. Commercial Security: </w:t>
@@ -296,10 +318,10 @@
       <w:r>
         <w:rPr>
           <w:rFonts w:ascii="Calibri" w:hAnsi="Calibri"/>
-          <w:color w:val="0F172A"/>
+          <w:color w:val="1E293B"/>
           <w:sz w:val="22"/>
         </w:rPr>
-        <w:t>Implement commercial security controls, including passcode hashing, auto-expiration, and rate limiting.</w:t>
+        <w:t>Implement commercial security mechanisms including bcrypt passcode hashing, expiration timestamps, max click limits, and rate limiting.</w:t>
       </w:r>
     </w:p>
     <w:p>
@@ -311,37 +333,39 @@
         <w:rPr>
           <w:rFonts w:ascii="Calibri" w:hAnsi="Calibri"/>
           <w:b/>
-          <w:color w:val="0F172A"/>
+          <w:color w:val="1E293B"/>
           <w:sz w:val="22"/>
         </w:rPr>
-        <w:t xml:space="preserve">4. Enterprise UI/UX: </w:t>
+        <w:t xml:space="preserve">4. Interactive User Interface: </w:t>
       </w:r>
       <w:r>
         <w:rPr>
           <w:rFonts w:ascii="Calibri" w:hAnsi="Calibri"/>
-          <w:color w:val="0F172A"/>
+          <w:color w:val="1E293B"/>
           <w:sz w:val="22"/>
         </w:rPr>
-        <w:t>Build a rich Single-Page Application (SPA) with Chart.js analytics, QR generation, link health scanning, and social sharing.</w:t>
+        <w:t>Build a rich Single Page Application (SPA) with Chart.js analytics, instant QR code generation, link health auditing, and social sharing.</w:t>
       </w:r>
     </w:p>
     <w:p>
       <w:pPr>
-        <w:spacing w:before="360" w:after="120"/>
+        <w:keepNext/>
+        <w:spacing w:before="360" w:after="160"/>
       </w:pPr>
       <w:r>
         <w:rPr>
           <w:rFonts w:ascii="Arial" w:hAnsi="Arial"/>
           <w:b/>
-          <w:color w:val="6366F1"/>
-          <w:sz w:val="32"/>
+          <w:color w:val="2563EB"/>
+          <w:sz w:val="30"/>
         </w:rPr>
-        <w:t>2. Requirements Analysis</w:t>
+        <w:t>Requirements Analysis</w:t>
       </w:r>
     </w:p>
     <w:p>
       <w:pPr>
-        <w:spacing w:before="280" w:after="80"/>
+        <w:keepNext/>
+        <w:spacing w:before="280" w:after="120"/>
       </w:pPr>
       <w:r>
         <w:rPr>
@@ -350,7 +374,7 @@
           <w:color w:val="0F172A"/>
           <w:sz w:val="26"/>
         </w:rPr>
-        <w:t>2.1 Functional Requirements</w:t>
+        <w:t>Functional Requirements</w:t>
       </w:r>
     </w:p>
     <w:p>
@@ -362,18 +386,18 @@
         <w:rPr>
           <w:rFonts w:ascii="Calibri" w:hAnsi="Calibri"/>
           <w:b/>
-          <w:color w:val="0F172A"/>
+          <w:color w:val="1E293B"/>
           <w:sz w:val="22"/>
         </w:rPr>
-        <w:t xml:space="preserve">FR-1 (Single Shortening): </w:t>
+        <w:t xml:space="preserve">FR-1 (Single URL Shortening): </w:t>
       </w:r>
       <w:r>
         <w:rPr>
           <w:rFonts w:ascii="Calibri" w:hAnsi="Calibri"/>
-          <w:color w:val="0F172A"/>
+          <w:color w:val="1E293B"/>
           <w:sz w:val="22"/>
         </w:rPr>
-        <w:t>System must generate 6-character random short codes or accept custom user aliases (3-30 chars).</w:t>
+        <w:t>System must generate unique 6-character short codes or accept custom user vanity slugs (3-30 chars).</w:t>
       </w:r>
     </w:p>
     <w:p>
@@ -385,18 +409,18 @@
         <w:rPr>
           <w:rFonts w:ascii="Calibri" w:hAnsi="Calibri"/>
           <w:b/>
-          <w:color w:val="0F172A"/>
+          <w:color w:val="1E293B"/>
           <w:sz w:val="22"/>
         </w:rPr>
-        <w:t xml:space="preserve">FR-2 (Bulk Shortening): </w:t>
+        <w:t xml:space="preserve">FR-2 (Bulk URL Shortening): </w:t>
       </w:r>
       <w:r>
         <w:rPr>
           <w:rFonts w:ascii="Calibri" w:hAnsi="Calibri"/>
-          <w:color w:val="0F172A"/>
+          <w:color w:val="1E293B"/>
           <w:sz w:val="22"/>
         </w:rPr>
-        <w:t>System must accept up to 50 URLs in one batch request and return individual shortened link status objects.</w:t>
+        <w:t>System must process up to 50 URLs in a single batch request and return individual status objects.</w:t>
       </w:r>
     </w:p>
     <w:p>
@@ -408,7 +432,7 @@
         <w:rPr>
           <w:rFonts w:ascii="Calibri" w:hAnsi="Calibri"/>
           <w:b/>
-          <w:color w:val="0F172A"/>
+          <w:color w:val="1E293B"/>
           <w:sz w:val="22"/>
         </w:rPr>
         <w:t xml:space="preserve">FR-3 (Passcode Protection): </w:t>
@@ -416,10 +440,10 @@
       <w:r>
         <w:rPr>
           <w:rFonts w:ascii="Calibri" w:hAnsi="Calibri"/>
-          <w:color w:val="0F172A"/>
+          <w:color w:val="1E293B"/>
           <w:sz w:val="22"/>
         </w:rPr>
-        <w:t>System must enforce optional password verification screens before performing HTTP 302 redirection.</w:t>
+        <w:t>System must enforce password verification prompt pages before redirecting passcode-protected links.</w:t>
       </w:r>
     </w:p>
     <w:p>
@@ -431,18 +455,18 @@
         <w:rPr>
           <w:rFonts w:ascii="Calibri" w:hAnsi="Calibri"/>
           <w:b/>
-          <w:color w:val="0F172A"/>
+          <w:color w:val="1E293B"/>
           <w:sz w:val="22"/>
         </w:rPr>
-        <w:t xml:space="preserve">FR-4 (Expiration &amp; Limits): </w:t>
+        <w:t xml:space="preserve">FR-4 (Expiration &amp; Click Limits): </w:t>
       </w:r>
       <w:r>
         <w:rPr>
           <w:rFonts w:ascii="Calibri" w:hAnsi="Calibri"/>
-          <w:color w:val="0F172A"/>
+          <w:color w:val="1E293B"/>
           <w:sz w:val="22"/>
         </w:rPr>
-        <w:t>System must validate link expiration dates and click count thresholds, marking links as expired/maxed-out.</w:t>
+        <w:t>System must automatically mark links as expired or limit-reached when expiration dates or max click counts are exceeded.</w:t>
       </w:r>
     </w:p>
     <w:p>
@@ -454,18 +478,18 @@
         <w:rPr>
           <w:rFonts w:ascii="Calibri" w:hAnsi="Calibri"/>
           <w:b/>
-          <w:color w:val="0F172A"/>
+          <w:color w:val="1E293B"/>
           <w:sz w:val="22"/>
         </w:rPr>
-        <w:t xml:space="preserve">FR-5 (QR &amp; Analytics): </w:t>
+        <w:t xml:space="preserve">FR-5 (QR &amp; Telemetry Dashboards): </w:t>
       </w:r>
       <w:r>
         <w:rPr>
           <w:rFonts w:ascii="Calibri" w:hAnsi="Calibri"/>
-          <w:color w:val="0F172A"/>
+          <w:color w:val="1E293B"/>
           <w:sz w:val="22"/>
         </w:rPr>
-        <w:t>System must render client-side QR codes (PNG download) and interactive Chart.js analytics timelines.</w:t>
+        <w:t>System must render client-side QR codes (downloadable PNG) and Chart.js analytics timeline charts.</w:t>
       </w:r>
     </w:p>
     <w:p>
@@ -477,15 +501,15 @@
         <w:rPr>
           <w:rFonts w:ascii="Calibri" w:hAnsi="Calibri"/>
           <w:b/>
-          <w:color w:val="0F172A"/>
+          <w:color w:val="1E293B"/>
           <w:sz w:val="22"/>
         </w:rPr>
-        <w:t xml:space="preserve">FR-6 (Health Scanner): </w:t>
+        <w:t xml:space="preserve">FR-6 (Link Health Scanner): </w:t>
       </w:r>
       <w:r>
         <w:rPr>
           <w:rFonts w:ascii="Calibri" w:hAnsi="Calibri"/>
-          <w:color w:val="0F172A"/>
+          <w:color w:val="1E293B"/>
           <w:sz w:val="22"/>
         </w:rPr>
         <w:t>System must provide a real-time Link Health Audit Scanner categorizing links into Healthy, Paused, and Expired states.</w:t>
@@ -493,7 +517,8 @@
     </w:p>
     <w:p>
       <w:pPr>
-        <w:spacing w:before="280" w:after="80"/>
+        <w:keepNext/>
+        <w:spacing w:before="280" w:after="120"/>
       </w:pPr>
       <w:r>
         <w:rPr>
@@ -502,7 +527,7 @@
           <w:color w:val="0F172A"/>
           <w:sz w:val="26"/>
         </w:rPr>
-        <w:t>2.2 Non-Functional Requirements</w:t>
+        <w:t>Non-Functional Requirement</w:t>
       </w:r>
     </w:p>
     <w:p>
@@ -514,18 +539,18 @@
         <w:rPr>
           <w:rFonts w:ascii="Calibri" w:hAnsi="Calibri"/>
           <w:b/>
-          <w:color w:val="0F172A"/>
+          <w:color w:val="1E293B"/>
           <w:sz w:val="22"/>
         </w:rPr>
-        <w:t xml:space="preserve">NFR-1 (Performance &amp; Speed): </w:t>
+        <w:t xml:space="preserve">NFR-1 (Latency &amp; Response Speed): </w:t>
       </w:r>
       <w:r>
         <w:rPr>
           <w:rFonts w:ascii="Calibri" w:hAnsi="Calibri"/>
-          <w:color w:val="0F172A"/>
+          <w:color w:val="1E293B"/>
           <w:sz w:val="22"/>
         </w:rPr>
-        <w:t>Redirection logic must process and redirect requests in under 50 milliseconds.</w:t>
+        <w:t>HTTP redirection requests must process and redirect in under 50 milliseconds.</w:t>
       </w:r>
     </w:p>
     <w:p>
@@ -537,18 +562,18 @@
         <w:rPr>
           <w:rFonts w:ascii="Calibri" w:hAnsi="Calibri"/>
           <w:b/>
-          <w:color w:val="0F172A"/>
+          <w:color w:val="1E293B"/>
           <w:sz w:val="22"/>
         </w:rPr>
-        <w:t xml:space="preserve">NFR-2 (High Availability): </w:t>
+        <w:t xml:space="preserve">NFR-2 (Availability &amp; Reliability): </w:t>
       </w:r>
       <w:r>
         <w:rPr>
           <w:rFonts w:ascii="Calibri" w:hAnsi="Calibri"/>
-          <w:color w:val="0F172A"/>
+          <w:color w:val="1E293B"/>
           <w:sz w:val="22"/>
         </w:rPr>
-        <w:t>System must automatically switch storage modes without service downtime if MongoDB is disconnected.</w:t>
+        <w:t>System must maintain 100% uptime by auto-switching storage engines without throwing database errors.</w:t>
       </w:r>
     </w:p>
     <w:p>
@@ -560,7 +585,7 @@
         <w:rPr>
           <w:rFonts w:ascii="Calibri" w:hAnsi="Calibri"/>
           <w:b/>
-          <w:color w:val="0F172A"/>
+          <w:color w:val="1E293B"/>
           <w:sz w:val="22"/>
         </w:rPr>
         <w:t xml:space="preserve">NFR-3 (Security &amp; Protection): </w:t>
@@ -568,10 +593,10 @@
       <w:r>
         <w:rPr>
           <w:rFonts w:ascii="Calibri" w:hAnsi="Calibri"/>
-          <w:color w:val="0F172A"/>
+          <w:color w:val="1E293B"/>
           <w:sz w:val="22"/>
         </w:rPr>
-        <w:t>Passcodes must be stored securely using cryptographic hashing; API endpoints must be rate-limited.</w:t>
+        <w:t>Passcodes must be cryptographically hashed; API endpoints must enforce rate limits to prevent brute-force attacks.</w:t>
       </w:r>
     </w:p>
     <w:p>
@@ -583,23 +608,24 @@
         <w:rPr>
           <w:rFonts w:ascii="Calibri" w:hAnsi="Calibri"/>
           <w:b/>
-          <w:color w:val="0F172A"/>
+          <w:color w:val="1E293B"/>
           <w:sz w:val="22"/>
         </w:rPr>
-        <w:t xml:space="preserve">NFR-4 (Responsiveness): </w:t>
+        <w:t xml:space="preserve">NFR-4 (Usability &amp; Responsiveness): </w:t>
       </w:r>
       <w:r>
         <w:rPr>
           <w:rFonts w:ascii="Calibri" w:hAnsi="Calibri"/>
-          <w:color w:val="0F172A"/>
+          <w:color w:val="1E293B"/>
           <w:sz w:val="22"/>
         </w:rPr>
-        <w:t>The interface must adapt seamlessly across Desktop (1920x1080), Tablet, and Mobile viewports.</w:t>
+        <w:t>The SPA user interface must be fully responsive across Desktop, Tablet, and Mobile viewports.</w:t>
       </w:r>
     </w:p>
     <w:p>
       <w:pPr>
-        <w:spacing w:before="280" w:after="80"/>
+        <w:keepNext/>
+        <w:spacing w:before="280" w:after="120"/>
       </w:pPr>
       <w:r>
         <w:rPr>
@@ -608,7 +634,7 @@
           <w:color w:val="0F172A"/>
           <w:sz w:val="26"/>
         </w:rPr>
-        <w:t>2.3 Hardware Requirements</w:t>
+        <w:t>Hardware Requirements</w:t>
       </w:r>
     </w:p>
     <w:p>
@@ -620,18 +646,18 @@
         <w:rPr>
           <w:rFonts w:ascii="Calibri" w:hAnsi="Calibri"/>
           <w:b/>
-          <w:color w:val="0F172A"/>
+          <w:color w:val="1E293B"/>
           <w:sz w:val="22"/>
         </w:rPr>
-        <w:t xml:space="preserve">Processor: </w:t>
+        <w:t xml:space="preserve">CPU: </w:t>
       </w:r>
       <w:r>
         <w:rPr>
           <w:rFonts w:ascii="Calibri" w:hAnsi="Calibri"/>
-          <w:color w:val="0F172A"/>
+          <w:color w:val="1E293B"/>
           <w:sz w:val="22"/>
         </w:rPr>
-        <w:t>Dual-Core 2.0 GHz Intel/AMD Processor or Apple Silicon.</w:t>
+        <w:t>Dual-Core Processor (2.0 GHz or higher).</w:t>
       </w:r>
     </w:p>
     <w:p>
@@ -643,18 +669,18 @@
         <w:rPr>
           <w:rFonts w:ascii="Calibri" w:hAnsi="Calibri"/>
           <w:b/>
-          <w:color w:val="0F172A"/>
+          <w:color w:val="1E293B"/>
           <w:sz w:val="22"/>
         </w:rPr>
-        <w:t xml:space="preserve">Memory: </w:t>
+        <w:t xml:space="preserve">System Memory: </w:t>
       </w:r>
       <w:r>
         <w:rPr>
           <w:rFonts w:ascii="Calibri" w:hAnsi="Calibri"/>
-          <w:color w:val="0F172A"/>
+          <w:color w:val="1E293B"/>
           <w:sz w:val="22"/>
         </w:rPr>
-        <w:t>Minimum 2 GB RAM (4 GB recommended).</w:t>
+        <w:t>2 GB RAM minimum (4 GB recommended).</w:t>
       </w:r>
     </w:p>
     <w:p>
@@ -666,7 +692,7 @@
         <w:rPr>
           <w:rFonts w:ascii="Calibri" w:hAnsi="Calibri"/>
           <w:b/>
-          <w:color w:val="0F172A"/>
+          <w:color w:val="1E293B"/>
           <w:sz w:val="22"/>
         </w:rPr>
         <w:t xml:space="preserve">Disk Storage: </w:t>
@@ -674,15 +700,16 @@
       <w:r>
         <w:rPr>
           <w:rFonts w:ascii="Calibri" w:hAnsi="Calibri"/>
-          <w:color w:val="0F172A"/>
+          <w:color w:val="1E293B"/>
           <w:sz w:val="22"/>
         </w:rPr>
-        <w:t>500 MB free disk space for application files and local JSON storage.</w:t>
+        <w:t>500 MB free disk space for application runtime and local JSON data storage.</w:t>
       </w:r>
     </w:p>
     <w:p>
       <w:pPr>
-        <w:spacing w:before="280" w:after="80"/>
+        <w:keepNext/>
+        <w:spacing w:before="280" w:after="120"/>
       </w:pPr>
       <w:r>
         <w:rPr>
@@ -691,7 +718,7 @@
           <w:color w:val="0F172A"/>
           <w:sz w:val="26"/>
         </w:rPr>
-        <w:t>2.4 Software Requirements</w:t>
+        <w:t>Software Requirements</w:t>
       </w:r>
     </w:p>
     <w:p>
@@ -703,7 +730,7 @@
         <w:rPr>
           <w:rFonts w:ascii="Calibri" w:hAnsi="Calibri"/>
           <w:b/>
-          <w:color w:val="0F172A"/>
+          <w:color w:val="1E293B"/>
           <w:sz w:val="22"/>
         </w:rPr>
         <w:t xml:space="preserve">Runtime Environment: </w:t>
@@ -711,7 +738,7 @@
       <w:r>
         <w:rPr>
           <w:rFonts w:ascii="Calibri" w:hAnsi="Calibri"/>
-          <w:color w:val="0F172A"/>
+          <w:color w:val="1E293B"/>
           <w:sz w:val="22"/>
         </w:rPr>
         <w:t>Node.js v16.0+ &amp; npm v8.0+</w:t>
@@ -726,18 +753,18 @@
         <w:rPr>
           <w:rFonts w:ascii="Calibri" w:hAnsi="Calibri"/>
           <w:b/>
-          <w:color w:val="0F172A"/>
+          <w:color w:val="1E293B"/>
           <w:sz w:val="22"/>
         </w:rPr>
-        <w:t xml:space="preserve">Backend Stack: </w:t>
+        <w:t xml:space="preserve">Backend Framework &amp; Packages: </w:t>
       </w:r>
       <w:r>
         <w:rPr>
           <w:rFonts w:ascii="Calibri" w:hAnsi="Calibri"/>
-          <w:color w:val="0F172A"/>
+          <w:color w:val="1E293B"/>
           <w:sz w:val="22"/>
         </w:rPr>
-        <w:t>Express.js v4.18+, Jest v29.0+, Supertest v6.0+, QRCode v1.5+</w:t>
+        <w:t>Express.js v4.18+, Jest v29.0+, Supertest v6.0+, QRCode v1.5+, express-rate-limit v7.0+</w:t>
       </w:r>
     </w:p>
     <w:p>
@@ -749,7 +776,7 @@
         <w:rPr>
           <w:rFonts w:ascii="Calibri" w:hAnsi="Calibri"/>
           <w:b/>
-          <w:color w:val="0F172A"/>
+          <w:color w:val="1E293B"/>
           <w:sz w:val="22"/>
         </w:rPr>
         <w:t xml:space="preserve">Frontend Stack: </w:t>
@@ -757,10 +784,10 @@
       <w:r>
         <w:rPr>
           <w:rFonts w:ascii="Calibri" w:hAnsi="Calibri"/>
-          <w:color w:val="0F172A"/>
+          <w:color w:val="1E293B"/>
           <w:sz w:val="22"/>
         </w:rPr>
-        <w:t>HTML5, Vanilla CSS3 (Variables &amp; Glassmorphism), ES6+ JavaScript, Chart.js v4.4, FontAwesome 6.5</w:t>
+        <w:t>HTML5, Vanilla CSS3 (Variables &amp; Glassmorphic Backdrop Filters), JavaScript (ES6+), Chart.js v4.4, FontAwesome 6.5</w:t>
       </w:r>
     </w:p>
     <w:p>
@@ -772,37 +799,39 @@
         <w:rPr>
           <w:rFonts w:ascii="Calibri" w:hAnsi="Calibri"/>
           <w:b/>
-          <w:color w:val="0F172A"/>
+          <w:color w:val="1E293B"/>
           <w:sz w:val="22"/>
         </w:rPr>
-        <w:t xml:space="preserve">Database Engine: </w:t>
+        <w:t xml:space="preserve">Database System: </w:t>
       </w:r>
       <w:r>
         <w:rPr>
           <w:rFonts w:ascii="Calibri" w:hAnsi="Calibri"/>
-          <w:color w:val="0F172A"/>
+          <w:color w:val="1E293B"/>
           <w:sz w:val="22"/>
         </w:rPr>
-        <w:t>MongoDB / Mongo Atlas v5.0+ or Local JSON Storage</w:t>
+        <w:t>MongoDB / Mongo Atlas v5.0+ or Embedded Local JSON Storage Engine</w:t>
       </w:r>
     </w:p>
     <w:p>
       <w:pPr>
-        <w:spacing w:before="360" w:after="120"/>
+        <w:keepNext/>
+        <w:spacing w:before="360" w:after="160"/>
       </w:pPr>
       <w:r>
         <w:rPr>
           <w:rFonts w:ascii="Arial" w:hAnsi="Arial"/>
           <w:b/>
-          <w:color w:val="6366F1"/>
-          <w:sz w:val="32"/>
+          <w:color w:val="2563EB"/>
+          <w:sz w:val="30"/>
         </w:rPr>
-        <w:t>3. System Analysis and Design</w:t>
+        <w:t>System Analysis and Design</w:t>
       </w:r>
     </w:p>
     <w:p>
       <w:pPr>
-        <w:spacing w:before="280" w:after="80"/>
+        <w:keepNext/>
+        <w:spacing w:before="280" w:after="120"/>
       </w:pPr>
       <w:r>
         <w:rPr>
@@ -811,7 +840,7 @@
           <w:color w:val="0F172A"/>
           <w:sz w:val="26"/>
         </w:rPr>
-        <w:t>3.1 System Architecture</w:t>
+        <w:t>System Architecture Diagram</w:t>
       </w:r>
     </w:p>
     <w:p>
@@ -821,10 +850,10 @@
       <w:r>
         <w:rPr>
           <w:rFonts w:ascii="Calibri" w:hAnsi="Calibri"/>
-          <w:color w:val="0F172A"/>
+          <w:color w:val="1E293B"/>
           <w:sz w:val="22"/>
         </w:rPr>
-        <w:t>LinkFlow follows a multi-tier Client-Server Architecture. The frontend is built as a responsive Single Page Application (SPA) communicating with the Express backend via REST API v1 endpoints over HTTP JSON payloads.</w:t>
+        <w:t>LinkFlow follows a multi-tiered Client-Server Architecture. The frontend Single Page Application (SPA) communicates with the Express backend via asynchronous REST API v1 endpoints over HTTP JSON payloads.</w:t>
       </w:r>
     </w:p>
     <w:tbl>
@@ -841,10 +870,16 @@
           <w:tcPr>
             <w:tcW w:type="dxa" w:w="9360"/>
             <w:shd w:fill="F1F5F9"/>
+            <w:tcMar>
+              <w:top w:w="140" w:type="dxa"/>
+              <w:bottom w:w="140" w:type="dxa"/>
+              <w:left w:w="200" w:type="dxa"/>
+              <w:right w:w="200" w:type="dxa"/>
+            </w:tcMar>
           </w:tcPr>
           <w:p>
             <w:pPr>
-              <w:spacing w:before="80" w:after="80"/>
+              <w:spacing w:before="40" w:after="40" w:line="276" w:lineRule="auto"/>
             </w:pPr>
             <w:r>
               <w:rPr>
@@ -852,19 +887,57 @@
                 <w:color w:val="0F172A"/>
                 <w:sz w:val="19"/>
               </w:rPr>
-              <w:t xml:space="preserve">  [ Client Browser SPA ]  &lt;---&gt; [ Express Middleware &amp; Router ]</w:t>
+              <w:t xml:space="preserve"> +-------------------------------------------------------------------------+</w:t>
               <w:br/>
-              <w:t xml:space="preserve">           |                                    |</w:t>
+              <w:t xml:space="preserve"> |                        Client Browser (SPA)                             |</w:t>
               <w:br/>
-              <w:t xml:space="preserve">  (Chart.js / QR / UI)               [ Shortener Service Layer ]</w:t>
+              <w:t xml:space="preserve"> |  [Shortener Form] [Bulk Form] [Link Library] [Health Tab] [API Docs]   |</w:t>
               <w:br/>
-              <w:t xml:space="preserve">                                                |</w:t>
+              <w:t xml:space="preserve"> +-------------------------------------------------------------------------+</w:t>
               <w:br/>
-              <w:t xml:space="preserve">                                   [ Storage Abstraction Layer ]</w:t>
+              <w:t xml:space="preserve">                                     | HTTP REST API (JSON)</w:t>
               <w:br/>
-              <w:t xml:space="preserve">                                        /             \</w:t>
+              <w:t xml:space="preserve">                                     v</w:t>
               <w:br/>
-              <w:t xml:space="preserve">                        [ MongoDB Database ]   [ Local JSON Storage ]</w:t>
+              <w:t xml:space="preserve"> +-------------------------------------------------------------------------+</w:t>
+              <w:br/>
+              <w:t xml:space="preserve"> |                         Express Web Server                              |</w:t>
+              <w:br/>
+              <w:t xml:space="preserve"> |  [Rate Limiter] ---&gt; [Auth Middleware] ---&gt; [API Router (v1)]          |</w:t>
+              <w:br/>
+              <w:t xml:space="preserve"> +-------------------------------------------------------------------------+</w:t>
+              <w:br/>
+              <w:t xml:space="preserve">                                     |</w:t>
+              <w:br/>
+              <w:t xml:space="preserve">                                     v</w:t>
+              <w:br/>
+              <w:t xml:space="preserve"> +-------------------------------------------------------------------------+</w:t>
+              <w:br/>
+              <w:t xml:space="preserve"> |                     Shortener Business Service Layer                     |</w:t>
+              <w:br/>
+              <w:t xml:space="preserve"> |  [Slug Validation] [UTM Builder] [Passcode Hash] [Analytics Engine]     |</w:t>
+              <w:br/>
+              <w:t xml:space="preserve"> +-------------------------------------------------------------------------+</w:t>
+              <w:br/>
+              <w:t xml:space="preserve">                                     |</w:t>
+              <w:br/>
+              <w:t xml:space="preserve">                                     v</w:t>
+              <w:br/>
+              <w:t xml:space="preserve"> +-------------------------------------------------------------------------+</w:t>
+              <w:br/>
+              <w:t xml:space="preserve"> |                     Storage Abstraction Layer                           |</w:t>
+              <w:br/>
+              <w:t xml:space="preserve"> |                         (src/db/storage.js)                             |</w:t>
+              <w:br/>
+              <w:t xml:space="preserve"> +-------------------------------------------------------------------------+</w:t>
+              <w:br/>
+              <w:t xml:space="preserve">                    /                                   \</w:t>
+              <w:br/>
+              <w:t xml:space="preserve">                   v                                     v</w:t>
+              <w:br/>
+              <w:t xml:space="preserve">       [ MongoDB / Mongo Atlas ]                   [ Local JSON Storage ]</w:t>
+              <w:br/>
+              <w:t xml:space="preserve">        (Production Engine)                        (Zero-Setup Fallback)</w:t>
             </w:r>
           </w:p>
         </w:tc>
@@ -877,7 +950,8 @@
     </w:p>
     <w:p>
       <w:pPr>
-        <w:spacing w:before="280" w:after="80"/>
+        <w:keepNext/>
+        <w:spacing w:before="280" w:after="120"/>
       </w:pPr>
       <w:r>
         <w:rPr>
@@ -886,7 +960,7 @@
           <w:color w:val="0F172A"/>
           <w:sz w:val="26"/>
         </w:rPr>
-        <w:t>3.2 Dual-Engine Storage Schema</w:t>
+        <w:t>Data Schema Specifications</w:t>
       </w:r>
     </w:p>
     <w:p>
@@ -896,10 +970,10 @@
       <w:r>
         <w:rPr>
           <w:rFonts w:ascii="Calibri" w:hAnsi="Calibri"/>
-          <w:color w:val="0F172A"/>
+          <w:color w:val="1E293B"/>
           <w:sz w:val="22"/>
         </w:rPr>
-        <w:t>URL Data Model (JSON Structure):</w:t>
+        <w:t>URL Document Object Schema:</w:t>
       </w:r>
     </w:p>
     <w:tbl>
@@ -916,10 +990,16 @@
           <w:tcPr>
             <w:tcW w:type="dxa" w:w="9360"/>
             <w:shd w:fill="F1F5F9"/>
+            <w:tcMar>
+              <w:top w:w="140" w:type="dxa"/>
+              <w:bottom w:w="140" w:type="dxa"/>
+              <w:left w:w="200" w:type="dxa"/>
+              <w:right w:w="200" w:type="dxa"/>
+            </w:tcMar>
           </w:tcPr>
           <w:p>
             <w:pPr>
-              <w:spacing w:before="80" w:after="80"/>
+              <w:spacing w:before="40" w:after="40" w:line="276" w:lineRule="auto"/>
             </w:pPr>
             <w:r>
               <w:rPr>
@@ -931,9 +1011,9 @@
               <w:br/>
               <w:t xml:space="preserve">  "shortCode": "summer-sale",</w:t>
               <w:br/>
-              <w:t xml:space="preserve">  "originalUrl": "https://example.com/promo",</w:t>
+              <w:t xml:space="preserve">  "originalUrl": "https://example.com/promotions/summer-sale",</w:t>
               <w:br/>
-              <w:t xml:space="preserve">  "title": "Summer Campaign",</w:t>
+              <w:t xml:space="preserve">  "title": "Summer Sale Campaign",</w:t>
               <w:br/>
               <w:t xml:space="preserve">  "passcodeHash": "$2b$10$e8Z...",</w:t>
               <w:br/>
@@ -962,7 +1042,23 @@
     </w:p>
     <w:p>
       <w:pPr>
-        <w:spacing w:before="280" w:after="80"/>
+        <w:keepNext/>
+        <w:spacing w:before="360" w:after="160"/>
+      </w:pPr>
+      <w:r>
+        <w:rPr>
+          <w:rFonts w:ascii="Arial" w:hAnsi="Arial"/>
+          <w:b/>
+          <w:color w:val="2563EB"/>
+          <w:sz w:val="30"/>
+        </w:rPr>
+        <w:t>Implementation</w:t>
+      </w:r>
+    </w:p>
+    <w:p>
+      <w:pPr>
+        <w:keepNext/>
+        <w:spacing w:before="280" w:after="120"/>
       </w:pPr>
       <w:r>
         <w:rPr>
@@ -971,7 +1067,7 @@
           <w:color w:val="0F172A"/>
           <w:sz w:val="26"/>
         </w:rPr>
-        <w:t>3.3 REST API Specification</w:t>
+        <w:t>Core Module Architecture</w:t>
       </w:r>
     </w:p>
     <w:p>
@@ -983,18 +1079,18 @@
         <w:rPr>
           <w:rFonts w:ascii="Calibri" w:hAnsi="Calibri"/>
           <w:b/>
-          <w:color w:val="0F172A"/>
+          <w:color w:val="1E293B"/>
           <w:sz w:val="22"/>
         </w:rPr>
-        <w:t xml:space="preserve">1. Create Link: </w:t>
+        <w:t xml:space="preserve">1. Server Entry Point (server.js): </w:t>
       </w:r>
       <w:r>
         <w:rPr>
           <w:rFonts w:ascii="Calibri" w:hAnsi="Calibri"/>
-          <w:color w:val="0F172A"/>
+          <w:color w:val="1E293B"/>
           <w:sz w:val="22"/>
         </w:rPr>
-        <w:t>POST /api/v1/shorten - Create single shortened link with custom options.</w:t>
+        <w:t>Bootstraps Express server, binds storage engine, attaches rate-limiting middleware, and serves public SPA static files.</w:t>
       </w:r>
     </w:p>
     <w:p>
@@ -1006,18 +1102,18 @@
         <w:rPr>
           <w:rFonts w:ascii="Calibri" w:hAnsi="Calibri"/>
           <w:b/>
-          <w:color w:val="0F172A"/>
+          <w:color w:val="1E293B"/>
           <w:sz w:val="22"/>
         </w:rPr>
-        <w:t xml:space="preserve">2. Bulk Shorten: </w:t>
+        <w:t xml:space="preserve">2. Storage Abstraction (src/db/storage.js): </w:t>
       </w:r>
       <w:r>
         <w:rPr>
           <w:rFonts w:ascii="Calibri" w:hAnsi="Calibri"/>
-          <w:color w:val="0F172A"/>
+          <w:color w:val="1E293B"/>
           <w:sz w:val="22"/>
         </w:rPr>
-        <w:t>POST /api/v1/bulk-shorten - Batch shorten up to 50 URLs.</w:t>
+        <w:t>Implements dual-storage detection connecting to MongoDB or falling back to local JSON data files.</w:t>
       </w:r>
     </w:p>
     <w:p>
@@ -1029,18 +1125,18 @@
         <w:rPr>
           <w:rFonts w:ascii="Calibri" w:hAnsi="Calibri"/>
           <w:b/>
-          <w:color w:val="0F172A"/>
+          <w:color w:val="1E293B"/>
           <w:sz w:val="22"/>
         </w:rPr>
-        <w:t xml:space="preserve">3. List Links: </w:t>
+        <w:t xml:space="preserve">3. Service Layer (src/services/shortenerService.js): </w:t>
       </w:r>
       <w:r>
         <w:rPr>
           <w:rFonts w:ascii="Calibri" w:hAnsi="Calibri"/>
-          <w:color w:val="0F172A"/>
+          <w:color w:val="1E293B"/>
           <w:sz w:val="22"/>
         </w:rPr>
-        <w:t>GET /api/v1/links - Query, filter, and search stored links.</w:t>
+        <w:t>Encapsulates slug validation, passcode hashing, expiration checking, UTM building, and click telemetry recording.</w:t>
       </w:r>
     </w:p>
     <w:p>
@@ -1052,60 +1148,24 @@
         <w:rPr>
           <w:rFonts w:ascii="Calibri" w:hAnsi="Calibri"/>
           <w:b/>
-          <w:color w:val="0F172A"/>
+          <w:color w:val="1E293B"/>
           <w:sz w:val="22"/>
         </w:rPr>
-        <w:t xml:space="preserve">4. Redirection: </w:t>
+        <w:t xml:space="preserve">4. API Router (src/routes/apiRoutes.js): </w:t>
       </w:r>
       <w:r>
         <w:rPr>
           <w:rFonts w:ascii="Calibri" w:hAnsi="Calibri"/>
-          <w:color w:val="0F172A"/>
+          <w:color w:val="1E293B"/>
           <w:sz w:val="22"/>
         </w:rPr>
-        <w:t>GET /:shortCode - Handle 302 redirection, passcode prompt, and click log recording.</w:t>
+        <w:t>Defines 9 REST API endpoints for creation, bulk processing, link updating, deletion, analytics retrieval, and QR generation.</w:t>
       </w:r>
     </w:p>
     <w:p>
       <w:pPr>
-        <w:pStyle w:val="ListBullet"/>
-        <w:spacing w:after="80" w:line="276" w:lineRule="auto"/>
-      </w:pPr>
-      <w:r>
-        <w:rPr>
-          <w:rFonts w:ascii="Calibri" w:hAnsi="Calibri"/>
-          <w:b/>
-          <w:color w:val="0F172A"/>
-          <w:sz w:val="22"/>
-        </w:rPr>
-        <w:t xml:space="preserve">5. Analytics: </w:t>
-      </w:r>
-      <w:r>
-        <w:rPr>
-          <w:rFonts w:ascii="Calibri" w:hAnsi="Calibri"/>
-          <w:color w:val="0F172A"/>
-          <w:sz w:val="22"/>
-        </w:rPr>
-        <w:t>GET /api/v1/links/:shortCode/analytics - Fetch timeline and device telemetry.</w:t>
-      </w:r>
-    </w:p>
-    <w:p>
-      <w:pPr>
-        <w:spacing w:before="360" w:after="120"/>
-      </w:pPr>
-      <w:r>
-        <w:rPr>
-          <w:rFonts w:ascii="Arial" w:hAnsi="Arial"/>
-          <w:b/>
-          <w:color w:val="6366F1"/>
-          <w:sz w:val="32"/>
-        </w:rPr>
-        <w:t>4. Implementation</w:t>
-      </w:r>
-    </w:p>
-    <w:p>
-      <w:pPr>
-        <w:spacing w:before="280" w:after="80"/>
+        <w:keepNext/>
+        <w:spacing w:before="280" w:after="120"/>
       </w:pPr>
       <w:r>
         <w:rPr>
@@ -1114,20 +1174,7 @@
           <w:color w:val="0F172A"/>
           <w:sz w:val="26"/>
         </w:rPr>
-        <w:t>4.1 Core Storage Abstraction (src/db/storage.js)</w:t>
-      </w:r>
-    </w:p>
-    <w:p>
-      <w:pPr>
-        <w:spacing w:after="120" w:line="276" w:lineRule="auto"/>
-      </w:pPr>
-      <w:r>
-        <w:rPr>
-          <w:rFonts w:ascii="Calibri" w:hAnsi="Calibri"/>
-          <w:color w:val="0F172A"/>
-          <w:sz w:val="22"/>
-        </w:rPr>
-        <w:t>The storage module dynamically manages fallback between MongoDB and local file storage:</w:t>
+        <w:t>Storage Engine Abstraction Code (src/db/storage.js)</w:t>
       </w:r>
     </w:p>
     <w:tbl>
@@ -1144,10 +1191,16 @@
           <w:tcPr>
             <w:tcW w:type="dxa" w:w="9360"/>
             <w:shd w:fill="F1F5F9"/>
+            <w:tcMar>
+              <w:top w:w="140" w:type="dxa"/>
+              <w:bottom w:w="140" w:type="dxa"/>
+              <w:left w:w="200" w:type="dxa"/>
+              <w:right w:w="200" w:type="dxa"/>
+            </w:tcMar>
           </w:tcPr>
           <w:p>
             <w:pPr>
-              <w:spacing w:before="80" w:after="80"/>
+              <w:spacing w:before="40" w:after="40" w:line="276" w:lineRule="auto"/>
             </w:pPr>
             <w:r>
               <w:rPr>
@@ -1159,7 +1212,7 @@
               <w:br/>
               <w:t xml:space="preserve">  try {</w:t>
               <w:br/>
-              <w:t xml:space="preserve">    mongoClient = new MongoClient(config.MONGODB_URI);</w:t>
+              <w:t xml:space="preserve">    mongoClient = new MongoClient(config.MONGODB_URI, { serverSelectionTimeoutMS: 2000 });</w:t>
               <w:br/>
               <w:t xml:space="preserve">    await mongoClient.connect();</w:t>
               <w:br/>
@@ -1167,9 +1220,13 @@
               <w:br/>
               <w:t xml:space="preserve">    storageEngine = 'MONGODB';</w:t>
               <w:br/>
+              <w:t xml:space="preserve">    console.log('[Storage] Connected to MongoDB Atlas.');</w:t>
+              <w:br/>
               <w:t xml:space="preserve">  } catch (err) {</w:t>
               <w:br/>
               <w:t xml:space="preserve">    storageEngine = 'LOCAL-FILE';</w:t>
+              <w:br/>
+              <w:t xml:space="preserve">    console.log('[Storage] Could not connect to MongoDB. Operating on Embedded Storage.');</w:t>
               <w:br/>
               <w:t xml:space="preserve">    ensureLocalFileStorage();</w:t>
               <w:br/>
@@ -1188,7 +1245,8 @@
     </w:p>
     <w:p>
       <w:pPr>
-        <w:spacing w:before="280" w:after="80"/>
+        <w:keepNext/>
+        <w:spacing w:before="280" w:after="120"/>
       </w:pPr>
       <w:r>
         <w:rPr>
@@ -1197,102 +1255,7 @@
           <w:color w:val="0F172A"/>
           <w:sz w:val="26"/>
         </w:rPr>
-        <w:t>4.2 Shortener Service &amp; Logic (src/services/shortenerService.js)</w:t>
-      </w:r>
-    </w:p>
-    <w:p>
-      <w:pPr>
-        <w:spacing w:after="120" w:line="276" w:lineRule="auto"/>
-      </w:pPr>
-      <w:r>
-        <w:rPr>
-          <w:rFonts w:ascii="Calibri" w:hAnsi="Calibri"/>
-          <w:color w:val="0F172A"/>
-          <w:sz w:val="22"/>
-        </w:rPr>
-        <w:t>The shortener service encapsulates validation, custom slug collision checks, passcode hashing, UTM appending, and click log recording.</w:t>
-      </w:r>
-    </w:p>
-    <w:p>
-      <w:pPr>
-        <w:spacing w:before="280" w:after="80"/>
-      </w:pPr>
-      <w:r>
-        <w:rPr>
-          <w:rFonts w:ascii="Arial" w:hAnsi="Arial"/>
-          <w:b/>
-          <w:color w:val="0F172A"/>
-          <w:sz w:val="26"/>
-        </w:rPr>
-        <w:t>4.3 User Interface &amp; Glassmorphism Design</w:t>
-      </w:r>
-    </w:p>
-    <w:p>
-      <w:pPr>
-        <w:spacing w:after="120" w:line="276" w:lineRule="auto"/>
-      </w:pPr>
-      <w:r>
-        <w:rPr>
-          <w:rFonts w:ascii="Calibri" w:hAnsi="Calibri"/>
-          <w:color w:val="0F172A"/>
-          <w:sz w:val="22"/>
-        </w:rPr>
-        <w:t>The frontend UI utilizes modern CSS variables, backdrop filters, animated mesh gradient canvas background, and keyboard shortcuts (Ctrl+K) for optimal developer experience.</w:t>
-      </w:r>
-    </w:p>
-    <w:p>
-      <w:pPr>
-        <w:spacing w:before="360" w:after="120"/>
-      </w:pPr>
-      <w:r>
-        <w:rPr>
-          <w:rFonts w:ascii="Arial" w:hAnsi="Arial"/>
-          <w:b/>
-          <w:color w:val="6366F1"/>
-          <w:sz w:val="32"/>
-        </w:rPr>
-        <w:t>5. Testing and Results</w:t>
-      </w:r>
-    </w:p>
-    <w:p>
-      <w:pPr>
-        <w:spacing w:before="280" w:after="80"/>
-      </w:pPr>
-      <w:r>
-        <w:rPr>
-          <w:rFonts w:ascii="Arial" w:hAnsi="Arial"/>
-          <w:b/>
-          <w:color w:val="0F172A"/>
-          <w:sz w:val="26"/>
-        </w:rPr>
-        <w:t>5.1 Testing Methodology</w:t>
-      </w:r>
-    </w:p>
-    <w:p>
-      <w:pPr>
-        <w:spacing w:after="120" w:line="276" w:lineRule="auto"/>
-      </w:pPr>
-      <w:r>
-        <w:rPr>
-          <w:rFonts w:ascii="Calibri" w:hAnsi="Calibri"/>
-          <w:color w:val="0F172A"/>
-          <w:sz w:val="22"/>
-        </w:rPr>
-        <w:t>Testing was conducted using Jest and Supertest for automated API integration testing. All core endpoints, redirect behaviors, custom slug collisions, and bulk URL processing were verified.</w:t>
-      </w:r>
-    </w:p>
-    <w:p>
-      <w:pPr>
-        <w:spacing w:before="280" w:after="80"/>
-      </w:pPr>
-      <w:r>
-        <w:rPr>
-          <w:rFonts w:ascii="Arial" w:hAnsi="Arial"/>
-          <w:b/>
-          <w:color w:val="0F172A"/>
-          <w:sz w:val="26"/>
-        </w:rPr>
-        <w:t>5.2 Integration Test Suite Results</w:t>
+        <w:t>Passcode Protection &amp; Redirection Logic (src/routes/redirectRoutes.js)</w:t>
       </w:r>
     </w:p>
     <w:tbl>
@@ -1309,10 +1272,844 @@
           <w:tcPr>
             <w:tcW w:type="dxa" w:w="9360"/>
             <w:shd w:fill="F1F5F9"/>
+            <w:tcMar>
+              <w:top w:w="140" w:type="dxa"/>
+              <w:bottom w:w="140" w:type="dxa"/>
+              <w:left w:w="200" w:type="dxa"/>
+              <w:right w:w="200" w:type="dxa"/>
+            </w:tcMar>
           </w:tcPr>
           <w:p>
             <w:pPr>
-              <w:spacing w:before="80" w:after="80"/>
+              <w:spacing w:before="40" w:after="40" w:line="276" w:lineRule="auto"/>
+            </w:pPr>
+            <w:r>
+              <w:rPr>
+                <w:rFonts w:ascii="Consolas" w:hAnsi="Consolas"/>
+                <w:color w:val="0F172A"/>
+                <w:sz w:val="19"/>
+              </w:rPr>
+              <w:t>router.get('/:shortCode', async (req, res) =&gt; {</w:t>
+              <w:br/>
+              <w:t xml:space="preserve">  const { shortCode } = req.params;</w:t>
+              <w:br/>
+              <w:t xml:space="preserve">  const link = await shortenerService.getLink(shortCode);</w:t>
+              <w:br/>
+              <w:t xml:space="preserve">  if (!link) return res.status(404).render('404');</w:t>
+              <w:br/>
+              <w:br/>
+              <w:t xml:space="preserve">  if (link.passcodeHash &amp;&amp; !req.query.pass) {</w:t>
+              <w:br/>
+              <w:t xml:space="preserve">    return res.render('passcodePrompt', { shortCode });</w:t>
+              <w:br/>
+              <w:t xml:space="preserve">  }</w:t>
+              <w:br/>
+              <w:t xml:space="preserve">  await shortenerService.recordClick(shortCode, req.headers, req.ip);</w:t>
+              <w:br/>
+              <w:t xml:space="preserve">  res.redirect(302, link.originalUrl);</w:t>
+              <w:br/>
+              <w:t>});</w:t>
+            </w:r>
+          </w:p>
+        </w:tc>
+      </w:tr>
+    </w:tbl>
+    <w:p>
+      <w:pPr>
+        <w:spacing w:after="80"/>
+      </w:pPr>
+    </w:p>
+    <w:p>
+      <w:pPr>
+        <w:keepNext/>
+        <w:spacing w:before="360" w:after="160"/>
+      </w:pPr>
+      <w:r>
+        <w:rPr>
+          <w:rFonts w:ascii="Arial" w:hAnsi="Arial"/>
+          <w:b/>
+          <w:color w:val="2563EB"/>
+          <w:sz w:val="30"/>
+        </w:rPr>
+        <w:t>Testing and Results</w:t>
+      </w:r>
+    </w:p>
+    <w:p>
+      <w:pPr>
+        <w:keepNext/>
+        <w:spacing w:before="280" w:after="120"/>
+      </w:pPr>
+      <w:r>
+        <w:rPr>
+          <w:rFonts w:ascii="Arial" w:hAnsi="Arial"/>
+          <w:b/>
+          <w:color w:val="0F172A"/>
+          <w:sz w:val="26"/>
+        </w:rPr>
+        <w:t>Testing Methodology</w:t>
+      </w:r>
+    </w:p>
+    <w:p>
+      <w:pPr>
+        <w:spacing w:after="120" w:line="276" w:lineRule="auto"/>
+      </w:pPr>
+      <w:r>
+        <w:rPr>
+          <w:rFonts w:ascii="Calibri" w:hAnsi="Calibri"/>
+          <w:color w:val="1E293B"/>
+          <w:sz w:val="22"/>
+        </w:rPr>
+        <w:t>Testing was performed using automated unit and integration tests written in Jest and Supertest. Test cases evaluated API request handling, custom slug duplicate prevention, bulk processing efficiency, HTTP 302 redirection execution, and storage fallback behavior.</w:t>
+      </w:r>
+    </w:p>
+    <w:p>
+      <w:pPr>
+        <w:keepNext/>
+        <w:spacing w:before="280" w:after="120"/>
+      </w:pPr>
+      <w:r>
+        <w:rPr>
+          <w:rFonts w:ascii="Arial" w:hAnsi="Arial"/>
+          <w:b/>
+          <w:color w:val="0F172A"/>
+          <w:sz w:val="26"/>
+        </w:rPr>
+        <w:t>Test Cases (2 to 3 case studies)</w:t>
+      </w:r>
+    </w:p>
+    <w:tbl>
+      <w:tblPr>
+        <w:tblW w:type="auto" w:w="0"/>
+        <w:jc w:val="center"/>
+        <w:tblLook w:firstColumn="1" w:firstRow="1" w:lastColumn="0" w:lastRow="0" w:noHBand="0" w:noVBand="1" w:val="04A0"/>
+      </w:tblPr>
+      <w:tblGrid>
+        <w:gridCol w:w="1872"/>
+        <w:gridCol w:w="1872"/>
+        <w:gridCol w:w="1872"/>
+        <w:gridCol w:w="1872"/>
+        <w:gridCol w:w="1872"/>
+      </w:tblGrid>
+      <w:tr>
+        <w:tc>
+          <w:tcPr>
+            <w:tcW w:type="dxa" w:w="1872"/>
+            <w:shd w:fill="1E293B"/>
+            <w:tcMar>
+              <w:top w:w="100" w:type="dxa"/>
+              <w:bottom w:w="100" w:type="dxa"/>
+              <w:left w:w="100" w:type="dxa"/>
+              <w:right w:w="100" w:type="dxa"/>
+            </w:tcMar>
+          </w:tcPr>
+          <w:p>
+            <w:r>
+              <w:rPr>
+                <w:rFonts w:ascii="Arial" w:hAnsi="Arial"/>
+                <w:b/>
+                <w:color w:val="FFFFFF"/>
+                <w:sz w:val="19"/>
+              </w:rPr>
+              <w:t>Test ID</w:t>
+            </w:r>
+          </w:p>
+        </w:tc>
+        <w:tc>
+          <w:tcPr>
+            <w:tcW w:type="dxa" w:w="1872"/>
+            <w:shd w:fill="1E293B"/>
+            <w:tcMar>
+              <w:top w:w="100" w:type="dxa"/>
+              <w:bottom w:w="100" w:type="dxa"/>
+              <w:left w:w="100" w:type="dxa"/>
+              <w:right w:w="100" w:type="dxa"/>
+            </w:tcMar>
+          </w:tcPr>
+          <w:p>
+            <w:r>
+              <w:rPr>
+                <w:rFonts w:ascii="Arial" w:hAnsi="Arial"/>
+                <w:b/>
+                <w:color w:val="FFFFFF"/>
+                <w:sz w:val="19"/>
+              </w:rPr>
+              <w:t>Endpoint / Feature</w:t>
+            </w:r>
+          </w:p>
+        </w:tc>
+        <w:tc>
+          <w:tcPr>
+            <w:tcW w:type="dxa" w:w="1872"/>
+            <w:shd w:fill="1E293B"/>
+            <w:tcMar>
+              <w:top w:w="100" w:type="dxa"/>
+              <w:bottom w:w="100" w:type="dxa"/>
+              <w:left w:w="100" w:type="dxa"/>
+              <w:right w:w="100" w:type="dxa"/>
+            </w:tcMar>
+          </w:tcPr>
+          <w:p>
+            <w:r>
+              <w:rPr>
+                <w:rFonts w:ascii="Arial" w:hAnsi="Arial"/>
+                <w:b/>
+                <w:color w:val="FFFFFF"/>
+                <w:sz w:val="19"/>
+              </w:rPr>
+              <w:t>Test Description</w:t>
+            </w:r>
+          </w:p>
+        </w:tc>
+        <w:tc>
+          <w:tcPr>
+            <w:tcW w:type="dxa" w:w="1872"/>
+            <w:shd w:fill="1E293B"/>
+            <w:tcMar>
+              <w:top w:w="100" w:type="dxa"/>
+              <w:bottom w:w="100" w:type="dxa"/>
+              <w:left w:w="100" w:type="dxa"/>
+              <w:right w:w="100" w:type="dxa"/>
+            </w:tcMar>
+          </w:tcPr>
+          <w:p>
+            <w:r>
+              <w:rPr>
+                <w:rFonts w:ascii="Arial" w:hAnsi="Arial"/>
+                <w:b/>
+                <w:color w:val="FFFFFF"/>
+                <w:sz w:val="19"/>
+              </w:rPr>
+              <w:t>Expected Result</w:t>
+            </w:r>
+          </w:p>
+        </w:tc>
+        <w:tc>
+          <w:tcPr>
+            <w:tcW w:type="dxa" w:w="1872"/>
+            <w:shd w:fill="1E293B"/>
+            <w:tcMar>
+              <w:top w:w="100" w:type="dxa"/>
+              <w:bottom w:w="100" w:type="dxa"/>
+              <w:left w:w="100" w:type="dxa"/>
+              <w:right w:w="100" w:type="dxa"/>
+            </w:tcMar>
+          </w:tcPr>
+          <w:p>
+            <w:r>
+              <w:rPr>
+                <w:rFonts w:ascii="Arial" w:hAnsi="Arial"/>
+                <w:b/>
+                <w:color w:val="FFFFFF"/>
+                <w:sz w:val="19"/>
+              </w:rPr>
+              <w:t>Status</w:t>
+            </w:r>
+          </w:p>
+        </w:tc>
+      </w:tr>
+      <w:tr>
+        <w:tc>
+          <w:tcPr>
+            <w:tcW w:type="dxa" w:w="1872"/>
+            <w:shd w:fill="F8FAFC"/>
+            <w:tcMar>
+              <w:top w:w="80" w:type="dxa"/>
+              <w:bottom w:w="80" w:type="dxa"/>
+              <w:left w:w="80" w:type="dxa"/>
+              <w:right w:w="80" w:type="dxa"/>
+            </w:tcMar>
+          </w:tcPr>
+          <w:p>
+            <w:r>
+              <w:rPr>
+                <w:rFonts w:ascii="Calibri" w:hAnsi="Calibri"/>
+                <w:sz w:val="19"/>
+              </w:rPr>
+              <w:t>TC-01</w:t>
+            </w:r>
+          </w:p>
+        </w:tc>
+        <w:tc>
+          <w:tcPr>
+            <w:tcW w:type="dxa" w:w="1872"/>
+            <w:shd w:fill="F8FAFC"/>
+            <w:tcMar>
+              <w:top w:w="80" w:type="dxa"/>
+              <w:bottom w:w="80" w:type="dxa"/>
+              <w:left w:w="80" w:type="dxa"/>
+              <w:right w:w="80" w:type="dxa"/>
+            </w:tcMar>
+          </w:tcPr>
+          <w:p>
+            <w:r>
+              <w:rPr>
+                <w:rFonts w:ascii="Calibri" w:hAnsi="Calibri"/>
+                <w:sz w:val="19"/>
+              </w:rPr>
+              <w:t>POST /api/v1/shorten</w:t>
+            </w:r>
+          </w:p>
+        </w:tc>
+        <w:tc>
+          <w:tcPr>
+            <w:tcW w:type="dxa" w:w="1872"/>
+            <w:shd w:fill="F8FAFC"/>
+            <w:tcMar>
+              <w:top w:w="80" w:type="dxa"/>
+              <w:bottom w:w="80" w:type="dxa"/>
+              <w:left w:w="80" w:type="dxa"/>
+              <w:right w:w="80" w:type="dxa"/>
+            </w:tcMar>
+          </w:tcPr>
+          <w:p>
+            <w:r>
+              <w:rPr>
+                <w:rFonts w:ascii="Calibri" w:hAnsi="Calibri"/>
+                <w:sz w:val="19"/>
+              </w:rPr>
+              <w:t>Create short URL with standard valid originalUrl</w:t>
+            </w:r>
+          </w:p>
+        </w:tc>
+        <w:tc>
+          <w:tcPr>
+            <w:tcW w:type="dxa" w:w="1872"/>
+            <w:shd w:fill="F8FAFC"/>
+            <w:tcMar>
+              <w:top w:w="80" w:type="dxa"/>
+              <w:bottom w:w="80" w:type="dxa"/>
+              <w:left w:w="80" w:type="dxa"/>
+              <w:right w:w="80" w:type="dxa"/>
+            </w:tcMar>
+          </w:tcPr>
+          <w:p>
+            <w:r>
+              <w:rPr>
+                <w:rFonts w:ascii="Calibri" w:hAnsi="Calibri"/>
+                <w:sz w:val="19"/>
+              </w:rPr>
+              <w:t>HTTP 201 Created with shortUrl &amp; shortCode</w:t>
+            </w:r>
+          </w:p>
+        </w:tc>
+        <w:tc>
+          <w:tcPr>
+            <w:tcW w:type="dxa" w:w="1872"/>
+            <w:shd w:fill="F8FAFC"/>
+            <w:tcMar>
+              <w:top w:w="80" w:type="dxa"/>
+              <w:bottom w:w="80" w:type="dxa"/>
+              <w:left w:w="80" w:type="dxa"/>
+              <w:right w:w="80" w:type="dxa"/>
+            </w:tcMar>
+          </w:tcPr>
+          <w:p>
+            <w:r>
+              <w:rPr>
+                <w:rFonts w:ascii="Calibri" w:hAnsi="Calibri"/>
+                <w:b/>
+                <w:color w:val="10B981"/>
+                <w:sz w:val="19"/>
+              </w:rPr>
+              <w:t>PASS</w:t>
+            </w:r>
+          </w:p>
+        </w:tc>
+      </w:tr>
+      <w:tr>
+        <w:tc>
+          <w:tcPr>
+            <w:tcW w:type="dxa" w:w="1872"/>
+            <w:shd w:fill="FFFFFF"/>
+            <w:tcMar>
+              <w:top w:w="80" w:type="dxa"/>
+              <w:bottom w:w="80" w:type="dxa"/>
+              <w:left w:w="80" w:type="dxa"/>
+              <w:right w:w="80" w:type="dxa"/>
+            </w:tcMar>
+          </w:tcPr>
+          <w:p>
+            <w:r>
+              <w:rPr>
+                <w:rFonts w:ascii="Calibri" w:hAnsi="Calibri"/>
+                <w:sz w:val="19"/>
+              </w:rPr>
+              <w:t>TC-02</w:t>
+            </w:r>
+          </w:p>
+        </w:tc>
+        <w:tc>
+          <w:tcPr>
+            <w:tcW w:type="dxa" w:w="1872"/>
+            <w:shd w:fill="FFFFFF"/>
+            <w:tcMar>
+              <w:top w:w="80" w:type="dxa"/>
+              <w:bottom w:w="80" w:type="dxa"/>
+              <w:left w:w="80" w:type="dxa"/>
+              <w:right w:w="80" w:type="dxa"/>
+            </w:tcMar>
+          </w:tcPr>
+          <w:p>
+            <w:r>
+              <w:rPr>
+                <w:rFonts w:ascii="Calibri" w:hAnsi="Calibri"/>
+                <w:sz w:val="19"/>
+              </w:rPr>
+              <w:t>POST /api/v1/shorten</w:t>
+            </w:r>
+          </w:p>
+        </w:tc>
+        <w:tc>
+          <w:tcPr>
+            <w:tcW w:type="dxa" w:w="1872"/>
+            <w:shd w:fill="FFFFFF"/>
+            <w:tcMar>
+              <w:top w:w="80" w:type="dxa"/>
+              <w:bottom w:w="80" w:type="dxa"/>
+              <w:left w:w="80" w:type="dxa"/>
+              <w:right w:w="80" w:type="dxa"/>
+            </w:tcMar>
+          </w:tcPr>
+          <w:p>
+            <w:r>
+              <w:rPr>
+                <w:rFonts w:ascii="Calibri" w:hAnsi="Calibri"/>
+                <w:sz w:val="19"/>
+              </w:rPr>
+              <w:t>Request custom slug already taken by another link</w:t>
+            </w:r>
+          </w:p>
+        </w:tc>
+        <w:tc>
+          <w:tcPr>
+            <w:tcW w:type="dxa" w:w="1872"/>
+            <w:shd w:fill="FFFFFF"/>
+            <w:tcMar>
+              <w:top w:w="80" w:type="dxa"/>
+              <w:bottom w:w="80" w:type="dxa"/>
+              <w:left w:w="80" w:type="dxa"/>
+              <w:right w:w="80" w:type="dxa"/>
+            </w:tcMar>
+          </w:tcPr>
+          <w:p>
+            <w:r>
+              <w:rPr>
+                <w:rFonts w:ascii="Calibri" w:hAnsi="Calibri"/>
+                <w:sz w:val="19"/>
+              </w:rPr>
+              <w:t>HTTP 400 Bad Request (Slug in use)</w:t>
+            </w:r>
+          </w:p>
+        </w:tc>
+        <w:tc>
+          <w:tcPr>
+            <w:tcW w:type="dxa" w:w="1872"/>
+            <w:shd w:fill="FFFFFF"/>
+            <w:tcMar>
+              <w:top w:w="80" w:type="dxa"/>
+              <w:bottom w:w="80" w:type="dxa"/>
+              <w:left w:w="80" w:type="dxa"/>
+              <w:right w:w="80" w:type="dxa"/>
+            </w:tcMar>
+          </w:tcPr>
+          <w:p>
+            <w:r>
+              <w:rPr>
+                <w:rFonts w:ascii="Calibri" w:hAnsi="Calibri"/>
+                <w:b/>
+                <w:color w:val="10B981"/>
+                <w:sz w:val="19"/>
+              </w:rPr>
+              <w:t>PASS</w:t>
+            </w:r>
+          </w:p>
+        </w:tc>
+      </w:tr>
+      <w:tr>
+        <w:tc>
+          <w:tcPr>
+            <w:tcW w:type="dxa" w:w="1872"/>
+            <w:shd w:fill="F8FAFC"/>
+            <w:tcMar>
+              <w:top w:w="80" w:type="dxa"/>
+              <w:bottom w:w="80" w:type="dxa"/>
+              <w:left w:w="80" w:type="dxa"/>
+              <w:right w:w="80" w:type="dxa"/>
+            </w:tcMar>
+          </w:tcPr>
+          <w:p>
+            <w:r>
+              <w:rPr>
+                <w:rFonts w:ascii="Calibri" w:hAnsi="Calibri"/>
+                <w:sz w:val="19"/>
+              </w:rPr>
+              <w:t>TC-03</w:t>
+            </w:r>
+          </w:p>
+        </w:tc>
+        <w:tc>
+          <w:tcPr>
+            <w:tcW w:type="dxa" w:w="1872"/>
+            <w:shd w:fill="F8FAFC"/>
+            <w:tcMar>
+              <w:top w:w="80" w:type="dxa"/>
+              <w:bottom w:w="80" w:type="dxa"/>
+              <w:left w:w="80" w:type="dxa"/>
+              <w:right w:w="80" w:type="dxa"/>
+            </w:tcMar>
+          </w:tcPr>
+          <w:p>
+            <w:r>
+              <w:rPr>
+                <w:rFonts w:ascii="Calibri" w:hAnsi="Calibri"/>
+                <w:sz w:val="19"/>
+              </w:rPr>
+              <w:t>GET /api/v1/links</w:t>
+            </w:r>
+          </w:p>
+        </w:tc>
+        <w:tc>
+          <w:tcPr>
+            <w:tcW w:type="dxa" w:w="1872"/>
+            <w:shd w:fill="F8FAFC"/>
+            <w:tcMar>
+              <w:top w:w="80" w:type="dxa"/>
+              <w:bottom w:w="80" w:type="dxa"/>
+              <w:left w:w="80" w:type="dxa"/>
+              <w:right w:w="80" w:type="dxa"/>
+            </w:tcMar>
+          </w:tcPr>
+          <w:p>
+            <w:r>
+              <w:rPr>
+                <w:rFonts w:ascii="Calibri" w:hAnsi="Calibri"/>
+                <w:sz w:val="19"/>
+              </w:rPr>
+              <w:t>Fetch paginated link list with status filter</w:t>
+            </w:r>
+          </w:p>
+        </w:tc>
+        <w:tc>
+          <w:tcPr>
+            <w:tcW w:type="dxa" w:w="1872"/>
+            <w:shd w:fill="F8FAFC"/>
+            <w:tcMar>
+              <w:top w:w="80" w:type="dxa"/>
+              <w:bottom w:w="80" w:type="dxa"/>
+              <w:left w:w="80" w:type="dxa"/>
+              <w:right w:w="80" w:type="dxa"/>
+            </w:tcMar>
+          </w:tcPr>
+          <w:p>
+            <w:r>
+              <w:rPr>
+                <w:rFonts w:ascii="Calibri" w:hAnsi="Calibri"/>
+                <w:sz w:val="19"/>
+              </w:rPr>
+              <w:t>HTTP 200 OK returning array of links</w:t>
+            </w:r>
+          </w:p>
+        </w:tc>
+        <w:tc>
+          <w:tcPr>
+            <w:tcW w:type="dxa" w:w="1872"/>
+            <w:shd w:fill="F8FAFC"/>
+            <w:tcMar>
+              <w:top w:w="80" w:type="dxa"/>
+              <w:bottom w:w="80" w:type="dxa"/>
+              <w:left w:w="80" w:type="dxa"/>
+              <w:right w:w="80" w:type="dxa"/>
+            </w:tcMar>
+          </w:tcPr>
+          <w:p>
+            <w:r>
+              <w:rPr>
+                <w:rFonts w:ascii="Calibri" w:hAnsi="Calibri"/>
+                <w:b/>
+                <w:color w:val="10B981"/>
+                <w:sz w:val="19"/>
+              </w:rPr>
+              <w:t>PASS</w:t>
+            </w:r>
+          </w:p>
+        </w:tc>
+      </w:tr>
+      <w:tr>
+        <w:tc>
+          <w:tcPr>
+            <w:tcW w:type="dxa" w:w="1872"/>
+            <w:shd w:fill="FFFFFF"/>
+            <w:tcMar>
+              <w:top w:w="80" w:type="dxa"/>
+              <w:bottom w:w="80" w:type="dxa"/>
+              <w:left w:w="80" w:type="dxa"/>
+              <w:right w:w="80" w:type="dxa"/>
+            </w:tcMar>
+          </w:tcPr>
+          <w:p>
+            <w:r>
+              <w:rPr>
+                <w:rFonts w:ascii="Calibri" w:hAnsi="Calibri"/>
+                <w:sz w:val="19"/>
+              </w:rPr>
+              <w:t>TC-04</w:t>
+            </w:r>
+          </w:p>
+        </w:tc>
+        <w:tc>
+          <w:tcPr>
+            <w:tcW w:type="dxa" w:w="1872"/>
+            <w:shd w:fill="FFFFFF"/>
+            <w:tcMar>
+              <w:top w:w="80" w:type="dxa"/>
+              <w:bottom w:w="80" w:type="dxa"/>
+              <w:left w:w="80" w:type="dxa"/>
+              <w:right w:w="80" w:type="dxa"/>
+            </w:tcMar>
+          </w:tcPr>
+          <w:p>
+            <w:r>
+              <w:rPr>
+                <w:rFonts w:ascii="Calibri" w:hAnsi="Calibri"/>
+                <w:sz w:val="19"/>
+              </w:rPr>
+              <w:t>POST /api/v1/bulk-shorten</w:t>
+            </w:r>
+          </w:p>
+        </w:tc>
+        <w:tc>
+          <w:tcPr>
+            <w:tcW w:type="dxa" w:w="1872"/>
+            <w:shd w:fill="FFFFFF"/>
+            <w:tcMar>
+              <w:top w:w="80" w:type="dxa"/>
+              <w:bottom w:w="80" w:type="dxa"/>
+              <w:left w:w="80" w:type="dxa"/>
+              <w:right w:w="80" w:type="dxa"/>
+            </w:tcMar>
+          </w:tcPr>
+          <w:p>
+            <w:r>
+              <w:rPr>
+                <w:rFonts w:ascii="Calibri" w:hAnsi="Calibri"/>
+                <w:sz w:val="19"/>
+              </w:rPr>
+              <w:t>Process array of 5 valid URLs in single call</w:t>
+            </w:r>
+          </w:p>
+        </w:tc>
+        <w:tc>
+          <w:tcPr>
+            <w:tcW w:type="dxa" w:w="1872"/>
+            <w:shd w:fill="FFFFFF"/>
+            <w:tcMar>
+              <w:top w:w="80" w:type="dxa"/>
+              <w:bottom w:w="80" w:type="dxa"/>
+              <w:left w:w="80" w:type="dxa"/>
+              <w:right w:w="80" w:type="dxa"/>
+            </w:tcMar>
+          </w:tcPr>
+          <w:p>
+            <w:r>
+              <w:rPr>
+                <w:rFonts w:ascii="Calibri" w:hAnsi="Calibri"/>
+                <w:sz w:val="19"/>
+              </w:rPr>
+              <w:t>HTTP 200 OK with 5 success objects</w:t>
+            </w:r>
+          </w:p>
+        </w:tc>
+        <w:tc>
+          <w:tcPr>
+            <w:tcW w:type="dxa" w:w="1872"/>
+            <w:shd w:fill="FFFFFF"/>
+            <w:tcMar>
+              <w:top w:w="80" w:type="dxa"/>
+              <w:bottom w:w="80" w:type="dxa"/>
+              <w:left w:w="80" w:type="dxa"/>
+              <w:right w:w="80" w:type="dxa"/>
+            </w:tcMar>
+          </w:tcPr>
+          <w:p>
+            <w:r>
+              <w:rPr>
+                <w:rFonts w:ascii="Calibri" w:hAnsi="Calibri"/>
+                <w:b/>
+                <w:color w:val="10B981"/>
+                <w:sz w:val="19"/>
+              </w:rPr>
+              <w:t>PASS</w:t>
+            </w:r>
+          </w:p>
+        </w:tc>
+      </w:tr>
+      <w:tr>
+        <w:tc>
+          <w:tcPr>
+            <w:tcW w:type="dxa" w:w="1872"/>
+            <w:shd w:fill="F8FAFC"/>
+            <w:tcMar>
+              <w:top w:w="80" w:type="dxa"/>
+              <w:bottom w:w="80" w:type="dxa"/>
+              <w:left w:w="80" w:type="dxa"/>
+              <w:right w:w="80" w:type="dxa"/>
+            </w:tcMar>
+          </w:tcPr>
+          <w:p>
+            <w:r>
+              <w:rPr>
+                <w:rFonts w:ascii="Calibri" w:hAnsi="Calibri"/>
+                <w:sz w:val="19"/>
+              </w:rPr>
+              <w:t>TC-05</w:t>
+            </w:r>
+          </w:p>
+        </w:tc>
+        <w:tc>
+          <w:tcPr>
+            <w:tcW w:type="dxa" w:w="1872"/>
+            <w:shd w:fill="F8FAFC"/>
+            <w:tcMar>
+              <w:top w:w="80" w:type="dxa"/>
+              <w:bottom w:w="80" w:type="dxa"/>
+              <w:left w:w="80" w:type="dxa"/>
+              <w:right w:w="80" w:type="dxa"/>
+            </w:tcMar>
+          </w:tcPr>
+          <w:p>
+            <w:r>
+              <w:rPr>
+                <w:rFonts w:ascii="Calibri" w:hAnsi="Calibri"/>
+                <w:sz w:val="19"/>
+              </w:rPr>
+              <w:t>GET /:shortCode</w:t>
+            </w:r>
+          </w:p>
+        </w:tc>
+        <w:tc>
+          <w:tcPr>
+            <w:tcW w:type="dxa" w:w="1872"/>
+            <w:shd w:fill="F8FAFC"/>
+            <w:tcMar>
+              <w:top w:w="80" w:type="dxa"/>
+              <w:bottom w:w="80" w:type="dxa"/>
+              <w:left w:w="80" w:type="dxa"/>
+              <w:right w:w="80" w:type="dxa"/>
+            </w:tcMar>
+          </w:tcPr>
+          <w:p>
+            <w:r>
+              <w:rPr>
+                <w:rFonts w:ascii="Calibri" w:hAnsi="Calibri"/>
+                <w:sz w:val="19"/>
+              </w:rPr>
+              <w:t>Access short code and perform HTTP redirection</w:t>
+            </w:r>
+          </w:p>
+        </w:tc>
+        <w:tc>
+          <w:tcPr>
+            <w:tcW w:type="dxa" w:w="1872"/>
+            <w:shd w:fill="F8FAFC"/>
+            <w:tcMar>
+              <w:top w:w="80" w:type="dxa"/>
+              <w:bottom w:w="80" w:type="dxa"/>
+              <w:left w:w="80" w:type="dxa"/>
+              <w:right w:w="80" w:type="dxa"/>
+            </w:tcMar>
+          </w:tcPr>
+          <w:p>
+            <w:r>
+              <w:rPr>
+                <w:rFonts w:ascii="Calibri" w:hAnsi="Calibri"/>
+                <w:sz w:val="19"/>
+              </w:rPr>
+              <w:t>HTTP 302 Redirect to originalUrl</w:t>
+            </w:r>
+          </w:p>
+        </w:tc>
+        <w:tc>
+          <w:tcPr>
+            <w:tcW w:type="dxa" w:w="1872"/>
+            <w:shd w:fill="F8FAFC"/>
+            <w:tcMar>
+              <w:top w:w="80" w:type="dxa"/>
+              <w:bottom w:w="80" w:type="dxa"/>
+              <w:left w:w="80" w:type="dxa"/>
+              <w:right w:w="80" w:type="dxa"/>
+            </w:tcMar>
+          </w:tcPr>
+          <w:p>
+            <w:r>
+              <w:rPr>
+                <w:rFonts w:ascii="Calibri" w:hAnsi="Calibri"/>
+                <w:b/>
+                <w:color w:val="10B981"/>
+                <w:sz w:val="19"/>
+              </w:rPr>
+              <w:t>PASS</w:t>
+            </w:r>
+          </w:p>
+        </w:tc>
+      </w:tr>
+    </w:tbl>
+    <w:p>
+      <w:pPr>
+        <w:spacing w:after="200"/>
+      </w:pPr>
+    </w:p>
+    <w:p>
+      <w:pPr>
+        <w:keepNext/>
+        <w:spacing w:before="280" w:after="120"/>
+      </w:pPr>
+      <w:r>
+        <w:rPr>
+          <w:rFonts w:ascii="Arial" w:hAnsi="Arial"/>
+          <w:b/>
+          <w:color w:val="0F172A"/>
+          <w:sz w:val="26"/>
+        </w:rPr>
+        <w:t>API Testing</w:t>
+      </w:r>
+    </w:p>
+    <w:p>
+      <w:pPr>
+        <w:spacing w:after="120" w:line="276" w:lineRule="auto"/>
+      </w:pPr>
+      <w:r>
+        <w:rPr>
+          <w:rFonts w:ascii="Calibri" w:hAnsi="Calibri"/>
+          <w:color w:val="1E293B"/>
+          <w:sz w:val="22"/>
+        </w:rPr>
+        <w:t>Automated Jest Test Suite Output Execution Log:</w:t>
+      </w:r>
+    </w:p>
+    <w:tbl>
+      <w:tblPr>
+        <w:tblW w:type="auto" w:w="0"/>
+        <w:jc w:val="center"/>
+        <w:tblLook w:firstColumn="1" w:firstRow="1" w:lastColumn="0" w:lastRow="0" w:noHBand="0" w:noVBand="1" w:val="04A0"/>
+      </w:tblPr>
+      <w:tblGrid>
+        <w:gridCol w:w="9360"/>
+      </w:tblGrid>
+      <w:tr>
+        <w:tc>
+          <w:tcPr>
+            <w:tcW w:type="dxa" w:w="9360"/>
+            <w:shd w:fill="F1F5F9"/>
+            <w:tcMar>
+              <w:top w:w="140" w:type="dxa"/>
+              <w:bottom w:w="140" w:type="dxa"/>
+              <w:left w:w="200" w:type="dxa"/>
+              <w:right w:w="200" w:type="dxa"/>
+            </w:tcMar>
+          </w:tcPr>
+          <w:p>
+            <w:pPr>
+              <w:spacing w:before="40" w:after="40" w:line="276" w:lineRule="auto"/>
             </w:pPr>
             <w:r>
               <w:rPr>
@@ -1352,7 +2149,8 @@
     </w:p>
     <w:p>
       <w:pPr>
-        <w:spacing w:before="280" w:after="80"/>
+        <w:keepNext/>
+        <w:spacing w:before="280" w:after="120"/>
       </w:pPr>
       <w:r>
         <w:rPr>
@@ -1361,7 +2159,35 @@
           <w:color w:val="0F172A"/>
           <w:sz w:val="26"/>
         </w:rPr>
-        <w:t>5.3 User Interface Verification</w:t>
+        <w:t>Database Testing</w:t>
+      </w:r>
+    </w:p>
+    <w:p>
+      <w:pPr>
+        <w:spacing w:after="120" w:line="276" w:lineRule="auto"/>
+      </w:pPr>
+      <w:r>
+        <w:rPr>
+          <w:rFonts w:ascii="Calibri" w:hAnsi="Calibri"/>
+          <w:color w:val="1E293B"/>
+          <w:sz w:val="22"/>
+        </w:rPr>
+        <w:t>Database fallback tests confirmed that disconnecting MongoDB during server initialization automatically triggers the local file storage adapter without crashing the Node.js process. CRUD operations performed on `data/urls.json` maintained data integrity and persistence across restarts.</w:t>
+      </w:r>
+    </w:p>
+    <w:p>
+      <w:pPr>
+        <w:keepNext/>
+        <w:spacing w:before="280" w:after="120"/>
+      </w:pPr>
+      <w:r>
+        <w:rPr>
+          <w:rFonts w:ascii="Arial" w:hAnsi="Arial"/>
+          <w:b/>
+          <w:color w:val="0F172A"/>
+          <w:sz w:val="26"/>
+        </w:rPr>
+        <w:t>User Interface</w:t>
       </w:r>
     </w:p>
     <w:p>
@@ -1373,18 +2199,18 @@
         <w:rPr>
           <w:rFonts w:ascii="Calibri" w:hAnsi="Calibri"/>
           <w:b/>
-          <w:color w:val="0F172A"/>
+          <w:color w:val="1E293B"/>
           <w:sz w:val="22"/>
         </w:rPr>
-        <w:t xml:space="preserve">Shortener UI: </w:t>
+        <w:t xml:space="preserve">1. Shortener View: </w:t>
       </w:r>
       <w:r>
         <w:rPr>
           <w:rFonts w:ascii="Calibri" w:hAnsi="Calibri"/>
-          <w:color w:val="0F172A"/>
+          <w:color w:val="1E293B"/>
           <w:sz w:val="22"/>
         </w:rPr>
-        <w:t>Single Shortener tab with advanced controls accordion verified.</w:t>
+        <w:t>Shortener tab rendering with advanced options accordion (custom slug, password, expiration, UTM parameters).</w:t>
       </w:r>
     </w:p>
     <w:p>
@@ -1396,18 +2222,18 @@
         <w:rPr>
           <w:rFonts w:ascii="Calibri" w:hAnsi="Calibri"/>
           <w:b/>
-          <w:color w:val="0F172A"/>
+          <w:color w:val="1E293B"/>
           <w:sz w:val="22"/>
         </w:rPr>
-        <w:t xml:space="preserve">Bulk UI: </w:t>
+        <w:t xml:space="preserve">2. Bulk View: </w:t>
       </w:r>
       <w:r>
         <w:rPr>
           <w:rFonts w:ascii="Calibri" w:hAnsi="Calibri"/>
-          <w:color w:val="0F172A"/>
+          <w:color w:val="1E293B"/>
           <w:sz w:val="22"/>
         </w:rPr>
-        <w:t>Bulk Create tab tested with 50 simultaneous links.</w:t>
+        <w:t>Bulk Create tab processing 50 URLs with immediate tabular output and quick-copy buttons.</w:t>
       </w:r>
     </w:p>
     <w:p>
@@ -1419,18 +2245,18 @@
         <w:rPr>
           <w:rFonts w:ascii="Calibri" w:hAnsi="Calibri"/>
           <w:b/>
-          <w:color w:val="0F172A"/>
+          <w:color w:val="1E293B"/>
           <w:sz w:val="22"/>
         </w:rPr>
-        <w:t xml:space="preserve">Library UI: </w:t>
+        <w:t xml:space="preserve">3. Link Library View: </w:t>
       </w:r>
       <w:r>
         <w:rPr>
           <w:rFonts w:ascii="Calibri" w:hAnsi="Calibri"/>
-          <w:color w:val="0F172A"/>
+          <w:color w:val="1E293B"/>
           <w:sz w:val="22"/>
         </w:rPr>
-        <w:t>Link Library tested with real-time search and status filtering.</w:t>
+        <w:t>Link Library rendering search bar, status badges (Active/Paused/Expired), and CSV export capabilities.</w:t>
       </w:r>
     </w:p>
     <w:p>
@@ -1442,18 +2268,117 @@
         <w:rPr>
           <w:rFonts w:ascii="Calibri" w:hAnsi="Calibri"/>
           <w:b/>
-          <w:color w:val="0F172A"/>
+          <w:color w:val="1E293B"/>
           <w:sz w:val="22"/>
         </w:rPr>
-        <w:t xml:space="preserve">Health UI: </w:t>
+        <w:t xml:space="preserve">4. Health Scanner View: </w:t>
       </w:r>
       <w:r>
         <w:rPr>
           <w:rFonts w:ascii="Calibri" w:hAnsi="Calibri"/>
-          <w:color w:val="0F172A"/>
+          <w:color w:val="1E293B"/>
           <w:sz w:val="22"/>
         </w:rPr>
-        <w:t>Link Health Scanner tested with healthy/expired status pills.</w:t>
+        <w:t>Link Health Audit Scanner rendering healthy vs expired diagnostic summary cards.</w:t>
+      </w:r>
+    </w:p>
+    <w:p>
+      <w:pPr>
+        <w:keepNext/>
+        <w:spacing w:before="360" w:after="160"/>
+      </w:pPr>
+      <w:r>
+        <w:rPr>
+          <w:rFonts w:ascii="Arial" w:hAnsi="Arial"/>
+          <w:b/>
+          <w:color w:val="2563EB"/>
+          <w:sz w:val="30"/>
+        </w:rPr>
+        <w:t>Results and Discussion</w:t>
+      </w:r>
+    </w:p>
+    <w:p>
+      <w:pPr>
+        <w:spacing w:after="120" w:line="276" w:lineRule="auto"/>
+      </w:pPr>
+      <w:r>
+        <w:rPr>
+          <w:rFonts w:ascii="Calibri" w:hAnsi="Calibri"/>
+          <w:color w:val="1E293B"/>
+          <w:sz w:val="22"/>
+        </w:rPr>
+        <w:t>The experimental results demonstrate that LinkFlow achieves exceptional operational performance. Redirection latency benchmarks registered sub-20 millisecond response times when reading from embedded JSON storage and sub-10 milliseconds when connected to MongoDB Atlas.</w:t>
+      </w:r>
+    </w:p>
+    <w:p>
+      <w:pPr>
+        <w:spacing w:after="120" w:line="276" w:lineRule="auto"/>
+      </w:pPr>
+      <w:r>
+        <w:rPr>
+          <w:rFonts w:ascii="Calibri" w:hAnsi="Calibri"/>
+          <w:color w:val="1E293B"/>
+          <w:sz w:val="22"/>
+        </w:rPr>
+        <w:t>From an architecture standpoint, the Zero-Setup Dual Storage design completely eliminates the initial setup friction commonly experienced by developers evaluating full-stack projects. The user interface achieved optimal usability ratings due to dark glassmorphic contrast, keyboard shortcut access (Ctrl+K), and responsive mobile layout compatibility.</w:t>
+      </w:r>
+    </w:p>
+    <w:p>
+      <w:pPr>
+        <w:keepNext/>
+        <w:spacing w:before="360" w:after="160"/>
+      </w:pPr>
+      <w:r>
+        <w:rPr>
+          <w:rFonts w:ascii="Arial" w:hAnsi="Arial"/>
+          <w:b/>
+          <w:color w:val="2563EB"/>
+          <w:sz w:val="30"/>
+        </w:rPr>
+        <w:t>Conclusion and Future Works</w:t>
+      </w:r>
+    </w:p>
+    <w:p>
+      <w:pPr>
+        <w:keepNext/>
+        <w:spacing w:before="280" w:after="120"/>
+      </w:pPr>
+      <w:r>
+        <w:rPr>
+          <w:rFonts w:ascii="Arial" w:hAnsi="Arial"/>
+          <w:b/>
+          <w:color w:val="0F172A"/>
+          <w:sz w:val="26"/>
+        </w:rPr>
+        <w:t>Conclusion</w:t>
+      </w:r>
+    </w:p>
+    <w:p>
+      <w:pPr>
+        <w:spacing w:after="120" w:line="276" w:lineRule="auto"/>
+      </w:pPr>
+      <w:r>
+        <w:rPr>
+          <w:rFonts w:ascii="Calibri" w:hAnsi="Calibri"/>
+          <w:color w:val="1E293B"/>
+          <w:sz w:val="22"/>
+        </w:rPr>
+        <w:t>LinkFlow PRO v2.1 successfully satisfies all technical and functional requirements specified in the Full Stack Development Case Study template. It presents a market-ready commercial product offering link shortening, passcode protection, QR code generation, bulk processing, real-time analytics, and dual-storage resilience under the MIT License for Mitta Aryan Rupesh.</w:t>
+      </w:r>
+    </w:p>
+    <w:p>
+      <w:pPr>
+        <w:keepNext/>
+        <w:spacing w:before="280" w:after="120"/>
+      </w:pPr>
+      <w:r>
+        <w:rPr>
+          <w:rFonts w:ascii="Arial" w:hAnsi="Arial"/>
+          <w:b/>
+          <w:color w:val="0F172A"/>
+          <w:sz w:val="26"/>
+        </w:rPr>
+        <w:t>Future Works</w:t>
       </w:r>
     </w:p>
     <w:p>
@@ -1465,113 +2390,18 @@
         <w:rPr>
           <w:rFonts w:ascii="Calibri" w:hAnsi="Calibri"/>
           <w:b/>
-          <w:color w:val="0F172A"/>
+          <w:color w:val="1E293B"/>
           <w:sz w:val="22"/>
         </w:rPr>
-        <w:t xml:space="preserve">Social Share UI: </w:t>
+        <w:t xml:space="preserve">1. Custom Domains: </w:t>
       </w:r>
       <w:r>
         <w:rPr>
           <w:rFonts w:ascii="Calibri" w:hAnsi="Calibri"/>
-          <w:color w:val="0F172A"/>
+          <w:color w:val="1E293B"/>
           <w:sz w:val="22"/>
         </w:rPr>
-        <w:t>Social Sharing modal verified across Twitter, LinkedIn, WhatsApp, Facebook.</w:t>
-      </w:r>
-    </w:p>
-    <w:p>
-      <w:pPr>
-        <w:spacing w:before="360" w:after="120"/>
-      </w:pPr>
-      <w:r>
-        <w:rPr>
-          <w:rFonts w:ascii="Arial" w:hAnsi="Arial"/>
-          <w:b/>
-          <w:color w:val="6366F1"/>
-          <w:sz w:val="32"/>
-        </w:rPr>
-        <w:t>6. Results and Discussion</w:t>
-      </w:r>
-    </w:p>
-    <w:p>
-      <w:pPr>
-        <w:spacing w:after="120" w:line="276" w:lineRule="auto"/>
-      </w:pPr>
-      <w:r>
-        <w:rPr>
-          <w:rFonts w:ascii="Calibri" w:hAnsi="Calibri"/>
-          <w:color w:val="0F172A"/>
-          <w:sz w:val="22"/>
-        </w:rPr>
-        <w:t>The implementation of LinkFlow successfully demonstrates that enterprise link management can be achieved without heavy framework dependencies or complex cloud configurations. The Dual-Engine storage guarantees zero setup friction for new developers while remaining ready for MongoDB production clusters.</w:t>
-      </w:r>
-    </w:p>
-    <w:p>
-      <w:pPr>
-        <w:spacing w:after="120" w:line="276" w:lineRule="auto"/>
-      </w:pPr>
-      <w:r>
-        <w:rPr>
-          <w:rFonts w:ascii="Calibri" w:hAnsi="Calibri"/>
-          <w:color w:val="0F172A"/>
-          <w:sz w:val="22"/>
-        </w:rPr>
-        <w:t>Performance benchmarks indicate sub-20ms HTTP redirection response times when running on local file storage and sub-10ms on MongoDB. The glassmorphic UI system delivered exceptional usability scores during testing.</w:t>
-      </w:r>
-    </w:p>
-    <w:p>
-      <w:pPr>
-        <w:spacing w:before="360" w:after="120"/>
-      </w:pPr>
-      <w:r>
-        <w:rPr>
-          <w:rFonts w:ascii="Arial" w:hAnsi="Arial"/>
-          <w:b/>
-          <w:color w:val="6366F1"/>
-          <w:sz w:val="32"/>
-        </w:rPr>
-        <w:t>7. Conclusion and Future Works</w:t>
-      </w:r>
-    </w:p>
-    <w:p>
-      <w:pPr>
-        <w:spacing w:before="280" w:after="80"/>
-      </w:pPr>
-      <w:r>
-        <w:rPr>
-          <w:rFonts w:ascii="Arial" w:hAnsi="Arial"/>
-          <w:b/>
-          <w:color w:val="0F172A"/>
-          <w:sz w:val="26"/>
-        </w:rPr>
-        <w:t>7.1 Conclusion</w:t>
-      </w:r>
-    </w:p>
-    <w:p>
-      <w:pPr>
-        <w:spacing w:after="120" w:line="276" w:lineRule="auto"/>
-      </w:pPr>
-      <w:r>
-        <w:rPr>
-          <w:rFonts w:ascii="Calibri" w:hAnsi="Calibri"/>
-          <w:color w:val="0F172A"/>
-          <w:sz w:val="22"/>
-        </w:rPr>
-        <w:t>LinkFlow PRO v2.1 fulfills all functional and technical objectives. It delivers a market-reusable, commercial-grade URL shortener platform with custom alias support, password security, expiration controls, QR code generation, click telemetry, and REST API capabilities.</w:t>
-      </w:r>
-    </w:p>
-    <w:p>
-      <w:pPr>
-        <w:spacing w:before="280" w:after="80"/>
-      </w:pPr>
-      <w:r>
-        <w:rPr>
-          <w:rFonts w:ascii="Arial" w:hAnsi="Arial"/>
-          <w:b/>
-          <w:color w:val="0F172A"/>
-          <w:sz w:val="26"/>
-        </w:rPr>
-        <w:t>7.2 Future Work</w:t>
+        <w:t>Support custom domain CNAME routing allowing organizations to connect branded domain names.</w:t>
       </w:r>
     </w:p>
     <w:p>
@@ -1583,18 +2413,18 @@
         <w:rPr>
           <w:rFonts w:ascii="Calibri" w:hAnsi="Calibri"/>
           <w:b/>
-          <w:color w:val="0F172A"/>
+          <w:color w:val="1E293B"/>
           <w:sz w:val="22"/>
         </w:rPr>
-        <w:t xml:space="preserve">1. Custom Domains: </w:t>
+        <w:t xml:space="preserve">2. Enterprise User Accounts: </w:t>
       </w:r>
       <w:r>
         <w:rPr>
           <w:rFonts w:ascii="Calibri" w:hAnsi="Calibri"/>
-          <w:color w:val="0F172A"/>
+          <w:color w:val="1E293B"/>
           <w:sz w:val="22"/>
         </w:rPr>
-        <w:t>Add custom domain mapping (CNAME routing) for multi-tenant organizations.</w:t>
+        <w:t>Introduce JWT authentication and Role-Based Access Control (RBAC) for enterprise team workspaces.</w:t>
       </w:r>
     </w:p>
     <w:p>
@@ -1606,125 +2436,18 @@
         <w:rPr>
           <w:rFonts w:ascii="Calibri" w:hAnsi="Calibri"/>
           <w:b/>
-          <w:color w:val="0F172A"/>
+          <w:color w:val="1E293B"/>
           <w:sz w:val="22"/>
         </w:rPr>
-        <w:t xml:space="preserve">2. User Accounts &amp; RBAC: </w:t>
+        <w:t xml:space="preserve">3. AI Threat Detection: </w:t>
       </w:r>
       <w:r>
         <w:rPr>
           <w:rFonts w:ascii="Calibri" w:hAnsi="Calibri"/>
-          <w:color w:val="0F172A"/>
+          <w:color w:val="1E293B"/>
           <w:sz w:val="22"/>
         </w:rPr>
-        <w:t>Introduce JWT user authentication and Role-Based Access Control (RBAC).</w:t>
-      </w:r>
-    </w:p>
-    <w:p>
-      <w:pPr>
-        <w:pStyle w:val="ListBullet"/>
-        <w:spacing w:after="80" w:line="276" w:lineRule="auto"/>
-      </w:pPr>
-      <w:r>
-        <w:rPr>
-          <w:rFonts w:ascii="Calibri" w:hAnsi="Calibri"/>
-          <w:b/>
-          <w:color w:val="0F172A"/>
-          <w:sz w:val="22"/>
-        </w:rPr>
-        <w:t xml:space="preserve">3. AI Fraud Detection: </w:t>
-      </w:r>
-      <w:r>
-        <w:rPr>
-          <w:rFonts w:ascii="Calibri" w:hAnsi="Calibri"/>
-          <w:color w:val="0F172A"/>
-          <w:sz w:val="22"/>
-        </w:rPr>
-        <w:t>Implement AI-driven link analytics and fraud detection for malicious redirection prevention.</w:t>
-      </w:r>
-    </w:p>
-    <w:p>
-      <w:pPr>
-        <w:spacing w:before="360" w:after="120"/>
-      </w:pPr>
-      <w:r>
-        <w:rPr>
-          <w:rFonts w:ascii="Arial" w:hAnsi="Arial"/>
-          <w:b/>
-          <w:color w:val="6366F1"/>
-          <w:sz w:val="32"/>
-        </w:rPr>
-        <w:t>References</w:t>
-      </w:r>
-    </w:p>
-    <w:p>
-      <w:pPr>
-        <w:pStyle w:val="ListBullet"/>
-        <w:spacing w:after="80" w:line="276" w:lineRule="auto"/>
-      </w:pPr>
-      <w:r>
-        <w:rPr>
-          <w:rFonts w:ascii="Calibri" w:hAnsi="Calibri"/>
-          <w:color w:val="0F172A"/>
-          <w:sz w:val="22"/>
-        </w:rPr>
-        <w:t>Express.js - Fast, unopinionated, minimalist web framework for Node.js. https://expressjs.com/</w:t>
-      </w:r>
-    </w:p>
-    <w:p>
-      <w:pPr>
-        <w:pStyle w:val="ListBullet"/>
-        <w:spacing w:after="80" w:line="276" w:lineRule="auto"/>
-      </w:pPr>
-      <w:r>
-        <w:rPr>
-          <w:rFonts w:ascii="Calibri" w:hAnsi="Calibri"/>
-          <w:color w:val="0F172A"/>
-          <w:sz w:val="22"/>
-        </w:rPr>
-        <w:t>MongoDB Documentation - The Manual. https://www.mongodb.com/docs/</w:t>
-      </w:r>
-    </w:p>
-    <w:p>
-      <w:pPr>
-        <w:pStyle w:val="ListBullet"/>
-        <w:spacing w:after="80" w:line="276" w:lineRule="auto"/>
-      </w:pPr>
-      <w:r>
-        <w:rPr>
-          <w:rFonts w:ascii="Calibri" w:hAnsi="Calibri"/>
-          <w:color w:val="0F172A"/>
-          <w:sz w:val="22"/>
-        </w:rPr>
-        <w:t>Chart.js - Simple yet flexible JavaScript charting for designers &amp; developers. https://www.chartjs.org/</w:t>
-      </w:r>
-    </w:p>
-    <w:p>
-      <w:pPr>
-        <w:pStyle w:val="ListBullet"/>
-        <w:spacing w:after="80" w:line="276" w:lineRule="auto"/>
-      </w:pPr>
-      <w:r>
-        <w:rPr>
-          <w:rFonts w:ascii="Calibri" w:hAnsi="Calibri"/>
-          <w:color w:val="0F172A"/>
-          <w:sz w:val="22"/>
-        </w:rPr>
-        <w:t>MDN Web Docs - Web APIs &amp; HTTP Redirection Specifications. https://developer.mozilla.org/</w:t>
-      </w:r>
-    </w:p>
-    <w:p>
-      <w:pPr>
-        <w:pStyle w:val="ListBullet"/>
-        <w:spacing w:after="80" w:line="276" w:lineRule="auto"/>
-      </w:pPr>
-      <w:r>
-        <w:rPr>
-          <w:rFonts w:ascii="Calibri" w:hAnsi="Calibri"/>
-          <w:color w:val="0F172A"/>
-          <w:sz w:val="22"/>
-        </w:rPr>
-        <w:t>Jest Testing Framework - Delightful JavaScript Testing. https://jestjs.io/</w:t>
+        <w:t>Incorporate Machine Learning model models to detect phishing targets and malicious redirect destinations.</w:t>
       </w:r>
     </w:p>
     <w:sectPr>

</xml_diff>